<commit_message>
update email, journal review, and teaching.
</commit_message>
<xml_diff>
--- a/_site/assets/PDF/CV_Jing_Xianwen_20211029.docx
+++ b/_site/assets/PDF/CV_Jing_Xianwen_20211029.docx
@@ -19,9 +19,8 @@
           <w:sz w:val="22"/>
           <w:szCs w:val="32"/>
         </w:rPr>
-        <w:t>(</w:t>
-      </w:r>
-      <w:proofErr w:type="gramStart"/>
+        <w:t xml:space="preserve">(updated </w:t>
+      </w:r>
       <w:r>
         <w:rPr>
           <w:b/>
@@ -29,9 +28,8 @@
           <w:sz w:val="22"/>
           <w:szCs w:val="32"/>
         </w:rPr>
-        <w:t>updated</w:t>
-      </w:r>
-      <w:proofErr w:type="gramEnd"/>
+        <w:t>on</w:t>
+      </w:r>
       <w:r>
         <w:rPr>
           <w:b/>
@@ -48,7 +46,7 @@
           <w:sz w:val="22"/>
           <w:szCs w:val="32"/>
         </w:rPr>
-        <w:t>on</w:t>
+        <w:t>Oct</w:t>
       </w:r>
       <w:r>
         <w:rPr>
@@ -66,7 +64,7 @@
           <w:sz w:val="22"/>
           <w:szCs w:val="32"/>
         </w:rPr>
-        <w:t>Oct</w:t>
+        <w:t>29</w:t>
       </w:r>
       <w:r>
         <w:rPr>
@@ -75,7 +73,7 @@
           <w:sz w:val="22"/>
           <w:szCs w:val="32"/>
         </w:rPr>
-        <w:t xml:space="preserve"> </w:t>
+        <w:t>, 20</w:t>
       </w:r>
       <w:r>
         <w:rPr>
@@ -84,7 +82,7 @@
           <w:sz w:val="22"/>
           <w:szCs w:val="32"/>
         </w:rPr>
-        <w:t>29</w:t>
+        <w:t>2</w:t>
       </w:r>
       <w:r>
         <w:rPr>
@@ -93,7 +91,7 @@
           <w:sz w:val="22"/>
           <w:szCs w:val="32"/>
         </w:rPr>
-        <w:t>, 20</w:t>
+        <w:t>1</w:t>
       </w:r>
       <w:r>
         <w:rPr>
@@ -102,24 +100,6 @@
           <w:sz w:val="22"/>
           <w:szCs w:val="32"/>
         </w:rPr>
-        <w:t>2</w:t>
-      </w:r>
-      <w:r>
-        <w:rPr>
-          <w:b/>
-          <w:color w:val="A6A6A6" w:themeColor="background1" w:themeShade="A6"/>
-          <w:sz w:val="22"/>
-          <w:szCs w:val="32"/>
-        </w:rPr>
-        <w:t>1</w:t>
-      </w:r>
-      <w:r>
-        <w:rPr>
-          <w:b/>
-          <w:color w:val="A6A6A6" w:themeColor="background1" w:themeShade="A6"/>
-          <w:sz w:val="22"/>
-          <w:szCs w:val="32"/>
-        </w:rPr>
         <w:t>)</w:t>
       </w:r>
     </w:p>
@@ -231,109 +211,96 @@
           <w:color w:val="000000" w:themeColor="text1"/>
           <w:lang w:val="de-DE"/>
         </w:rPr>
-        <w:t>No.11 </w:t>
-      </w:r>
-      <w:proofErr w:type="spellStart"/>
+        <w:t>No.11 Cihu Road, Huangshi, Hubei</w:t>
+      </w:r>
       <w:r>
         <w:rPr>
           <w:color w:val="000000" w:themeColor="text1"/>
           <w:lang w:val="de-DE"/>
         </w:rPr>
-        <w:t>Cihu</w:t>
-      </w:r>
-      <w:proofErr w:type="spellEnd"/>
+        <w:t xml:space="preserve"> </w:t>
+      </w:r>
       <w:r>
         <w:rPr>
           <w:color w:val="000000" w:themeColor="text1"/>
           <w:lang w:val="de-DE"/>
         </w:rPr>
-        <w:t> Road, Huangshi, </w:t>
-      </w:r>
-      <w:proofErr w:type="spellStart"/>
-      <w:r>
+        <w:t>435002, China</w:t>
+      </w:r>
+    </w:p>
+    <w:p>
+      <w:pPr>
+        <w:ind w:firstLine="420"/>
         <w:rPr>
           <w:color w:val="000000" w:themeColor="text1"/>
           <w:lang w:val="de-DE"/>
         </w:rPr>
-        <w:t>Hubei</w:t>
-      </w:r>
-      <w:proofErr w:type="spellEnd"/>
+      </w:pPr>
       <w:r>
         <w:rPr>
           <w:color w:val="000000" w:themeColor="text1"/>
           <w:lang w:val="de-DE"/>
         </w:rPr>
-        <w:t xml:space="preserve"> </w:t>
+        <w:t>TEL</w:t>
       </w:r>
       <w:r>
         <w:rPr>
           <w:color w:val="000000" w:themeColor="text1"/>
           <w:lang w:val="de-DE"/>
         </w:rPr>
-        <w:t>435002, China</w:t>
-      </w:r>
-    </w:p>
-    <w:p>
-      <w:pPr>
-        <w:ind w:firstLine="420"/>
+        <w:tab/>
+      </w:r>
+      <w:r>
         <w:rPr>
           <w:color w:val="000000" w:themeColor="text1"/>
           <w:lang w:val="de-DE"/>
         </w:rPr>
-      </w:pPr>
+        <w:tab/>
+      </w:r>
       <w:r>
         <w:rPr>
           <w:color w:val="000000" w:themeColor="text1"/>
           <w:lang w:val="de-DE"/>
         </w:rPr>
-        <w:t>TEL</w:t>
+        <w:tab/>
       </w:r>
       <w:r>
         <w:rPr>
           <w:color w:val="000000" w:themeColor="text1"/>
           <w:lang w:val="de-DE"/>
         </w:rPr>
-        <w:tab/>
-      </w:r>
-      <w:r>
+        <w:t>+86 15652230923</w:t>
+      </w:r>
+    </w:p>
+    <w:p>
+      <w:pPr>
+        <w:ind w:left="420"/>
         <w:rPr>
           <w:color w:val="000000" w:themeColor="text1"/>
           <w:lang w:val="de-DE"/>
         </w:rPr>
-        <w:tab/>
-      </w:r>
+      </w:pPr>
       <w:r>
         <w:rPr>
           <w:color w:val="000000" w:themeColor="text1"/>
           <w:lang w:val="de-DE"/>
         </w:rPr>
-        <w:tab/>
+        <w:t>E</w:t>
       </w:r>
       <w:r>
         <w:rPr>
           <w:color w:val="000000" w:themeColor="text1"/>
           <w:lang w:val="de-DE"/>
         </w:rPr>
-        <w:t>+86 15652230923</w:t>
-      </w:r>
-    </w:p>
-    <w:p>
-      <w:pPr>
-        <w:ind w:left="420"/>
+        <w:t>-</w:t>
+      </w:r>
+      <w:r>
         <w:rPr>
           <w:color w:val="000000" w:themeColor="text1"/>
           <w:lang w:val="de-DE"/>
         </w:rPr>
-      </w:pPr>
-      <w:proofErr w:type="gramStart"/>
-      <w:r>
-        <w:rPr>
-          <w:color w:val="000000" w:themeColor="text1"/>
-          <w:lang w:val="de-DE"/>
-        </w:rPr>
-        <w:t>EMAIL</w:t>
-      </w:r>
-      <w:proofErr w:type="gramEnd"/>
+        <w:t>MAIL</w:t>
+      </w:r>
       <w:r>
         <w:rPr>
           <w:color w:val="000000" w:themeColor="text1"/>
@@ -359,10 +326,9 @@
         <w:r>
           <w:rPr>
             <w:rStyle w:val="Hyperlink"/>
-            <w:color w:val="000000" w:themeColor="text1"/>
             <w:lang w:val="de-DE"/>
           </w:rPr>
-          <w:t>jingxianwen@live.cn</w:t>
+          <w:t>jingxw@hbnu.edu.cn</w:t>
         </w:r>
       </w:hyperlink>
     </w:p>
@@ -768,33 +734,8 @@
           <w:color w:val="000000" w:themeColor="text1"/>
           <w:lang w:val="de-DE"/>
         </w:rPr>
-        <w:t>No.11 </w:t>
-      </w:r>
-      <w:proofErr w:type="spellStart"/>
-      <w:r>
-        <w:rPr>
-          <w:color w:val="000000" w:themeColor="text1"/>
-          <w:lang w:val="de-DE"/>
-        </w:rPr>
-        <w:t>Cihu</w:t>
-      </w:r>
-      <w:proofErr w:type="spellEnd"/>
-      <w:r>
-        <w:rPr>
-          <w:color w:val="000000" w:themeColor="text1"/>
-          <w:lang w:val="de-DE"/>
-        </w:rPr>
-        <w:t> Road, Huangshi, </w:t>
-      </w:r>
-      <w:proofErr w:type="spellStart"/>
-      <w:r>
-        <w:rPr>
-          <w:color w:val="000000" w:themeColor="text1"/>
-          <w:lang w:val="de-DE"/>
-        </w:rPr>
-        <w:t>Hubei</w:t>
-      </w:r>
-      <w:proofErr w:type="spellEnd"/>
+        <w:t>No.11 Cihu Road, Huangshi, Hubei</w:t>
+      </w:r>
       <w:r>
         <w:rPr>
           <w:color w:val="000000" w:themeColor="text1"/>
@@ -1050,21 +991,7 @@
           <w:color w:val="000000" w:themeColor="text1"/>
         </w:rPr>
         <w:tab/>
-        <w:t xml:space="preserve">5-1-5 </w:t>
-      </w:r>
-      <w:proofErr w:type="spellStart"/>
-      <w:r>
-        <w:rPr>
-          <w:color w:val="000000" w:themeColor="text1"/>
-        </w:rPr>
-        <w:t>Kashiwanoha</w:t>
-      </w:r>
-      <w:proofErr w:type="spellEnd"/>
-      <w:r>
-        <w:rPr>
-          <w:color w:val="000000" w:themeColor="text1"/>
-        </w:rPr>
-        <w:t>, Kashiwa, Chiba 277-8568</w:t>
+        <w:t>5-1-5 Kashiwanoha, Kashiwa, Chiba 277-8568</w:t>
       </w:r>
       <w:r>
         <w:rPr>
@@ -1196,49 +1123,7 @@
         <w:rPr>
           <w:color w:val="000000" w:themeColor="text1"/>
         </w:rPr>
-        <w:t xml:space="preserve">No.46 </w:t>
-      </w:r>
-      <w:proofErr w:type="spellStart"/>
-      <w:r>
-        <w:rPr>
-          <w:color w:val="000000" w:themeColor="text1"/>
-        </w:rPr>
-        <w:t>Zhongguancun</w:t>
-      </w:r>
-      <w:proofErr w:type="spellEnd"/>
-      <w:r>
-        <w:rPr>
-          <w:color w:val="000000" w:themeColor="text1"/>
-        </w:rPr>
-        <w:t xml:space="preserve"> </w:t>
-      </w:r>
-      <w:proofErr w:type="spellStart"/>
-      <w:r>
-        <w:rPr>
-          <w:color w:val="000000" w:themeColor="text1"/>
-        </w:rPr>
-        <w:t>Nandajie</w:t>
-      </w:r>
-      <w:proofErr w:type="spellEnd"/>
-      <w:r>
-        <w:rPr>
-          <w:color w:val="000000" w:themeColor="text1"/>
-        </w:rPr>
-        <w:t xml:space="preserve">, </w:t>
-      </w:r>
-      <w:proofErr w:type="spellStart"/>
-      <w:r>
-        <w:rPr>
-          <w:color w:val="000000" w:themeColor="text1"/>
-        </w:rPr>
-        <w:t>Haidian</w:t>
-      </w:r>
-      <w:proofErr w:type="spellEnd"/>
-      <w:r>
-        <w:rPr>
-          <w:color w:val="000000" w:themeColor="text1"/>
-        </w:rPr>
-        <w:t>, Beijing 100081, CHINA</w:t>
+        <w:t>No.46 Zhongguancun Nandajie, Haidian, Beijing 100081, CHINA</w:t>
       </w:r>
     </w:p>
     <w:p>
@@ -1575,107 +1460,7 @@
           <w:sz w:val="24"/>
           <w:szCs w:val="24"/>
         </w:rPr>
-        <w:t xml:space="preserve">., </w:t>
-      </w:r>
-      <w:proofErr w:type="spellStart"/>
-      <w:r>
-        <w:rPr>
-          <w:rFonts w:ascii="Times New Roman" w:eastAsia="STSong" w:hAnsi="Times New Roman"/>
-          <w:color w:val="000000" w:themeColor="text1"/>
-          <w:sz w:val="24"/>
-          <w:szCs w:val="24"/>
-        </w:rPr>
-        <w:t>Xianglei</w:t>
-      </w:r>
-      <w:proofErr w:type="spellEnd"/>
-      <w:r>
-        <w:rPr>
-          <w:rFonts w:ascii="Times New Roman" w:eastAsia="STSong" w:hAnsi="Times New Roman"/>
-          <w:color w:val="000000" w:themeColor="text1"/>
-          <w:sz w:val="24"/>
-          <w:szCs w:val="24"/>
-        </w:rPr>
-        <w:t xml:space="preserve"> Huang, </w:t>
-      </w:r>
-      <w:proofErr w:type="spellStart"/>
-      <w:r>
-        <w:rPr>
-          <w:rFonts w:ascii="Times New Roman" w:eastAsia="STSong" w:hAnsi="Times New Roman"/>
-          <w:color w:val="000000" w:themeColor="text1"/>
-          <w:sz w:val="24"/>
-          <w:szCs w:val="24"/>
-        </w:rPr>
-        <w:t>Xiuhong</w:t>
-      </w:r>
-      <w:proofErr w:type="spellEnd"/>
-      <w:r>
-        <w:rPr>
-          <w:rFonts w:ascii="Times New Roman" w:eastAsia="STSong" w:hAnsi="Times New Roman"/>
-          <w:color w:val="000000" w:themeColor="text1"/>
-          <w:sz w:val="24"/>
-          <w:szCs w:val="24"/>
-        </w:rPr>
-        <w:t xml:space="preserve"> Chen, Dong L. Wu, Peter </w:t>
-      </w:r>
-      <w:proofErr w:type="spellStart"/>
-      <w:r>
-        <w:rPr>
-          <w:rFonts w:ascii="Times New Roman" w:eastAsia="STSong" w:hAnsi="Times New Roman"/>
-          <w:color w:val="000000" w:themeColor="text1"/>
-          <w:sz w:val="24"/>
-          <w:szCs w:val="24"/>
-        </w:rPr>
-        <w:t>Pilewskie</w:t>
-      </w:r>
-      <w:proofErr w:type="spellEnd"/>
-      <w:r>
-        <w:rPr>
-          <w:rFonts w:ascii="Times New Roman" w:eastAsia="STSong" w:hAnsi="Times New Roman"/>
-          <w:color w:val="000000" w:themeColor="text1"/>
-          <w:sz w:val="24"/>
-          <w:szCs w:val="24"/>
-        </w:rPr>
-        <w:t xml:space="preserve">, </w:t>
-      </w:r>
-      <w:proofErr w:type="spellStart"/>
-      <w:r>
-        <w:rPr>
-          <w:rFonts w:ascii="Times New Roman" w:eastAsia="STSong" w:hAnsi="Times New Roman"/>
-          <w:color w:val="000000" w:themeColor="text1"/>
-          <w:sz w:val="24"/>
-          <w:szCs w:val="24"/>
-        </w:rPr>
-        <w:t>Odele</w:t>
-      </w:r>
-      <w:proofErr w:type="spellEnd"/>
-      <w:r>
-        <w:rPr>
-          <w:rFonts w:ascii="Times New Roman" w:eastAsia="STSong" w:hAnsi="Times New Roman"/>
-          <w:color w:val="000000" w:themeColor="text1"/>
-          <w:sz w:val="24"/>
-          <w:szCs w:val="24"/>
-        </w:rPr>
-        <w:t xml:space="preserve"> Coddington</w:t>
-      </w:r>
-      <w:proofErr w:type="spellStart"/>
-      <w:r>
-        <w:rPr>
-          <w:rFonts w:ascii="Times New Roman" w:eastAsia="STSong" w:hAnsi="Times New Roman"/>
-          <w:color w:val="000000" w:themeColor="text1"/>
-          <w:sz w:val="24"/>
-          <w:szCs w:val="24"/>
-        </w:rPr>
-        <w:t>, Erik Ri</w:t>
-      </w:r>
-      <w:proofErr w:type="spellEnd"/>
-      <w:r>
-        <w:rPr>
-          <w:rFonts w:ascii="Times New Roman" w:eastAsia="STSong" w:hAnsi="Times New Roman"/>
-          <w:color w:val="000000" w:themeColor="text1"/>
-          <w:sz w:val="24"/>
-          <w:szCs w:val="24"/>
-        </w:rPr>
-        <w:t>chard, 2021. Direct influence of solar spectral irradiance on the high-latitude surface climate. Journal of</w:t>
+        <w:t>., Xianglei Huang, Xiuhong Chen, Dong L. Wu, Peter Pilewskie, Odele Coddington, Erik Richard, 2021. Direct influence of solar spectral irradiance on the high-latitude surface climate. Journal of</w:t>
       </w:r>
       <w:r>
         <w:rPr>
@@ -1747,7 +1532,7 @@
           <w:sz w:val="24"/>
           <w:szCs w:val="24"/>
         </w:rPr>
-        <w:t xml:space="preserve">Highlighted on the </w:t>
+        <w:t>Highlighted on the</w:t>
       </w:r>
       <w:r>
         <w:rPr>
@@ -1756,8 +1541,60 @@
           <w:sz w:val="24"/>
           <w:szCs w:val="24"/>
         </w:rPr>
-        <w:t xml:space="preserve">SCOSTEP /PRESTO </w:t>
-      </w:r>
+        <w:t xml:space="preserve"> </w:t>
+      </w:r>
+      <w:hyperlink r:id="rId9" w:history="1">
+        <w:r>
+          <w:rPr>
+            <w:rStyle w:val="Hyperlink"/>
+            <w:rFonts w:ascii="Times New Roman" w:eastAsia="STSong" w:hAnsi="Times New Roman"/>
+            <w:color w:val="FF0000"/>
+            <w:sz w:val="24"/>
+            <w:szCs w:val="24"/>
+          </w:rPr>
+          <w:t xml:space="preserve">SCOSTEP /PRESTO </w:t>
+        </w:r>
+        <w:r>
+          <w:rPr>
+            <w:rStyle w:val="Hyperlink"/>
+            <w:rFonts w:ascii="Times New Roman" w:eastAsia="STSong" w:hAnsi="Times New Roman"/>
+            <w:color w:val="FF0000"/>
+            <w:sz w:val="24"/>
+            <w:szCs w:val="24"/>
+          </w:rPr>
+          <w:t>newsletter</w:t>
+        </w:r>
+        <w:r>
+          <w:rPr>
+            <w:rStyle w:val="Hyperlink"/>
+            <w:rFonts w:ascii="Times New Roman" w:eastAsia="STSong" w:hAnsi="Times New Roman"/>
+            <w:color w:val="FF0000"/>
+            <w:sz w:val="24"/>
+            <w:szCs w:val="24"/>
+          </w:rPr>
+          <w:t xml:space="preserve"> Vol.</w:t>
+        </w:r>
+        <w:r>
+          <w:rPr>
+            <w:rStyle w:val="Hyperlink"/>
+            <w:rFonts w:ascii="Times New Roman" w:eastAsia="STSong" w:hAnsi="Times New Roman"/>
+            <w:color w:val="FF0000"/>
+            <w:sz w:val="24"/>
+            <w:szCs w:val="24"/>
+          </w:rPr>
+          <w:t xml:space="preserve"> </w:t>
+        </w:r>
+        <w:r>
+          <w:rPr>
+            <w:rStyle w:val="Hyperlink"/>
+            <w:rFonts w:ascii="Times New Roman" w:eastAsia="STSong" w:hAnsi="Times New Roman"/>
+            <w:color w:val="FF0000"/>
+            <w:sz w:val="24"/>
+            <w:szCs w:val="24"/>
+          </w:rPr>
+          <w:t>26</w:t>
+        </w:r>
+      </w:hyperlink>
       <w:r>
         <w:rPr>
           <w:rFonts w:ascii="Times New Roman" w:eastAsia="STSong" w:hAnsi="Times New Roman"/>
@@ -1765,7 +1602,7 @@
           <w:sz w:val="24"/>
           <w:szCs w:val="24"/>
         </w:rPr>
-        <w:t>newsletter</w:t>
+        <w:t>,</w:t>
       </w:r>
       <w:r>
         <w:rPr>
@@ -1774,7 +1611,7 @@
           <w:sz w:val="24"/>
           <w:szCs w:val="24"/>
         </w:rPr>
-        <w:t xml:space="preserve"> Vol.</w:t>
+        <w:t xml:space="preserve"> </w:t>
       </w:r>
       <w:r>
         <w:rPr>
@@ -1783,7 +1620,16 @@
           <w:sz w:val="24"/>
           <w:szCs w:val="24"/>
         </w:rPr>
-        <w:t xml:space="preserve"> </w:t>
+        <w:t>Jan 2021</w:t>
+      </w:r>
+      <w:r>
+        <w:rPr>
+          <w:rFonts w:ascii="Times New Roman" w:eastAsia="STSong" w:hAnsi="Times New Roman"/>
+          <w:color w:val="000000" w:themeColor="text1"/>
+          <w:sz w:val="24"/>
+          <w:szCs w:val="24"/>
+        </w:rPr>
+        <w:t xml:space="preserve">; </w:t>
       </w:r>
       <w:r>
         <w:rPr>
@@ -1792,45 +1638,9 @@
           <w:sz w:val="24"/>
           <w:szCs w:val="24"/>
         </w:rPr>
-        <w:t>26,</w:t>
-      </w:r>
-      <w:r>
-        <w:rPr>
-          <w:rFonts w:ascii="Times New Roman" w:eastAsia="STSong" w:hAnsi="Times New Roman"/>
-          <w:color w:val="FF0000"/>
-          <w:sz w:val="24"/>
-          <w:szCs w:val="24"/>
-        </w:rPr>
-        <w:t xml:space="preserve"> </w:t>
-      </w:r>
-      <w:r>
-        <w:rPr>
-          <w:rFonts w:ascii="Times New Roman" w:eastAsia="STSong" w:hAnsi="Times New Roman"/>
-          <w:color w:val="FF0000"/>
-          <w:sz w:val="24"/>
-          <w:szCs w:val="24"/>
-        </w:rPr>
-        <w:t>Jan 2021</w:t>
-      </w:r>
-      <w:r>
-        <w:rPr>
-          <w:rFonts w:ascii="Times New Roman" w:eastAsia="STSong" w:hAnsi="Times New Roman"/>
-          <w:color w:val="000000" w:themeColor="text1"/>
-          <w:sz w:val="24"/>
-          <w:szCs w:val="24"/>
-        </w:rPr>
-        <w:t xml:space="preserve">; </w:t>
-      </w:r>
-      <w:r>
-        <w:rPr>
-          <w:rFonts w:ascii="Times New Roman" w:eastAsia="STSong" w:hAnsi="Times New Roman"/>
-          <w:color w:val="FF0000"/>
-          <w:sz w:val="24"/>
-          <w:szCs w:val="24"/>
-        </w:rPr>
         <w:t xml:space="preserve">Featured by </w:t>
       </w:r>
-      <w:hyperlink r:id="rId9" w:history="1">
+      <w:hyperlink r:id="rId10" w:history="1">
         <w:r>
           <w:rPr>
             <w:rStyle w:val="Hyperlink"/>
@@ -1844,6 +1654,16 @@
       </w:hyperlink>
       <w:r>
         <w:rPr>
+          <w:rStyle w:val="Hyperlink"/>
+          <w:rFonts w:ascii="Times New Roman" w:eastAsia="STSong" w:hAnsi="Times New Roman"/>
+          <w:color w:val="FF0000"/>
+          <w:sz w:val="24"/>
+          <w:szCs w:val="24"/>
+        </w:rPr>
+        <w:t>s</w:t>
+      </w:r>
+      <w:r>
+        <w:rPr>
           <w:rFonts w:eastAsia="STSong"/>
           <w:color w:val="000000" w:themeColor="text1"/>
         </w:rPr>
@@ -1885,27 +1705,7 @@
           <w:sz w:val="24"/>
           <w:szCs w:val="24"/>
         </w:rPr>
-        <w:t xml:space="preserve">, K. Suzuki, and T. </w:t>
-      </w:r>
-      <w:proofErr w:type="spellStart"/>
-      <w:r>
-        <w:rPr>
-          <w:rFonts w:ascii="Times New Roman" w:eastAsia="STSong" w:hAnsi="Times New Roman"/>
-          <w:color w:val="000000" w:themeColor="text1"/>
-          <w:sz w:val="24"/>
-          <w:szCs w:val="24"/>
-        </w:rPr>
-        <w:t>Michibata</w:t>
-      </w:r>
-      <w:proofErr w:type="spellEnd"/>
-      <w:r>
-        <w:rPr>
-          <w:rFonts w:ascii="Times New Roman" w:eastAsia="STSong" w:hAnsi="Times New Roman"/>
-          <w:color w:val="000000" w:themeColor="text1"/>
-          <w:sz w:val="24"/>
-          <w:szCs w:val="24"/>
-        </w:rPr>
-        <w:t xml:space="preserve">, </w:t>
+        <w:t xml:space="preserve">, K. Suzuki, and T. Michibata, </w:t>
       </w:r>
       <w:r>
         <w:rPr>
@@ -1962,7 +1762,7 @@
         </w:rPr>
         <w:t xml:space="preserve"> </w:t>
       </w:r>
-      <w:hyperlink r:id="rId10" w:history="1">
+      <w:hyperlink r:id="rId11" w:history="1">
         <w:r>
           <w:rPr>
             <w:rStyle w:val="Hyperlink"/>
@@ -1998,25 +1798,14 @@
           <w:szCs w:val="24"/>
         </w:rPr>
       </w:pPr>
-      <w:proofErr w:type="spellStart"/>
-      <w:r>
-        <w:rPr>
-          <w:rFonts w:ascii="Times New Roman" w:eastAsia="STSong" w:hAnsi="Times New Roman"/>
-          <w:color w:val="000000" w:themeColor="text1"/>
-          <w:sz w:val="24"/>
-          <w:szCs w:val="24"/>
-        </w:rPr>
-        <w:t>Michibata</w:t>
-      </w:r>
-      <w:proofErr w:type="spellEnd"/>
-      <w:r>
-        <w:rPr>
-          <w:rFonts w:ascii="Times New Roman" w:eastAsia="STSong" w:hAnsi="Times New Roman"/>
-          <w:color w:val="000000" w:themeColor="text1"/>
-          <w:sz w:val="24"/>
-          <w:szCs w:val="24"/>
-        </w:rPr>
-        <w:t xml:space="preserve">, T., Suzuki, K., Ogura, T., and </w:t>
+      <w:r>
+        <w:rPr>
+          <w:rFonts w:ascii="Times New Roman" w:eastAsia="STSong" w:hAnsi="Times New Roman"/>
+          <w:color w:val="000000" w:themeColor="text1"/>
+          <w:sz w:val="24"/>
+          <w:szCs w:val="24"/>
+        </w:rPr>
+        <w:t xml:space="preserve">Michibata, T., Suzuki, K., Ogura, T., and </w:t>
       </w:r>
       <w:r>
         <w:rPr>
@@ -2035,29 +1824,9 @@
           <w:sz w:val="24"/>
           <w:szCs w:val="24"/>
         </w:rPr>
-        <w:t xml:space="preserve">.: Incorporation of inline warm rain diagnostics into the COSP2 satellite simulator for process-oriented model evaluation, </w:t>
-      </w:r>
-      <w:proofErr w:type="spellStart"/>
-      <w:r>
-        <w:rPr>
-          <w:rFonts w:ascii="Times New Roman" w:eastAsia="STSong" w:hAnsi="Times New Roman"/>
-          <w:color w:val="000000" w:themeColor="text1"/>
-          <w:sz w:val="24"/>
-          <w:szCs w:val="24"/>
-        </w:rPr>
-        <w:t>Geosci</w:t>
-      </w:r>
-      <w:proofErr w:type="spellEnd"/>
-      <w:r>
-        <w:rPr>
-          <w:rFonts w:ascii="Times New Roman" w:eastAsia="STSong" w:hAnsi="Times New Roman"/>
-          <w:color w:val="000000" w:themeColor="text1"/>
-          <w:sz w:val="24"/>
-          <w:szCs w:val="24"/>
-        </w:rPr>
-        <w:t xml:space="preserve">. Model Dev., 12, 4297–4307, </w:t>
-      </w:r>
-      <w:hyperlink r:id="rId11" w:history="1">
+        <w:t xml:space="preserve">.: Incorporation of inline warm rain diagnostics into the COSP2 satellite simulator for process-oriented model evaluation, Geosci. Model Dev., 12, 4297–4307, </w:t>
+      </w:r>
+      <w:hyperlink r:id="rId12" w:history="1">
         <w:r>
           <w:rPr>
             <w:rStyle w:val="Hyperlink"/>
@@ -2101,27 +1870,7 @@
           <w:sz w:val="24"/>
           <w:szCs w:val="24"/>
         </w:rPr>
-        <w:t xml:space="preserve">Stephens G. L., M. Christensen, T. Andrews, J. Haywood, F. </w:t>
-      </w:r>
-      <w:proofErr w:type="spellStart"/>
-      <w:r>
-        <w:rPr>
-          <w:rFonts w:ascii="Times New Roman" w:eastAsia="STSong" w:hAnsi="Times New Roman"/>
-          <w:color w:val="000000" w:themeColor="text1"/>
-          <w:sz w:val="24"/>
-          <w:szCs w:val="24"/>
-        </w:rPr>
-        <w:t>Malavelle</w:t>
-      </w:r>
-      <w:proofErr w:type="spellEnd"/>
-      <w:r>
-        <w:rPr>
-          <w:rFonts w:ascii="Times New Roman" w:eastAsia="STSong" w:hAnsi="Times New Roman"/>
-          <w:color w:val="000000" w:themeColor="text1"/>
-          <w:sz w:val="24"/>
-          <w:szCs w:val="24"/>
-        </w:rPr>
-        <w:t xml:space="preserve">, K. Suzuki, </w:t>
+        <w:t xml:space="preserve">Stephens G. L., M. Christensen, T. Andrews, J. Haywood, F. Malavelle, K. Suzuki, </w:t>
       </w:r>
       <w:r>
         <w:rPr>
@@ -2140,47 +1889,7 @@
           <w:sz w:val="24"/>
           <w:szCs w:val="24"/>
         </w:rPr>
-        <w:t xml:space="preserve">, M. </w:t>
-      </w:r>
-      <w:proofErr w:type="spellStart"/>
-      <w:r>
-        <w:rPr>
-          <w:rFonts w:ascii="Times New Roman" w:eastAsia="STSong" w:hAnsi="Times New Roman"/>
-          <w:color w:val="000000" w:themeColor="text1"/>
-          <w:sz w:val="24"/>
-          <w:szCs w:val="24"/>
-        </w:rPr>
-        <w:t>Lebsock</w:t>
-      </w:r>
-      <w:proofErr w:type="spellEnd"/>
-      <w:r>
-        <w:rPr>
-          <w:rFonts w:ascii="Times New Roman" w:eastAsia="STSong" w:hAnsi="Times New Roman"/>
-          <w:color w:val="000000" w:themeColor="text1"/>
-          <w:sz w:val="24"/>
-          <w:szCs w:val="24"/>
-        </w:rPr>
-        <w:t xml:space="preserve">, J. L. Li, H. </w:t>
-      </w:r>
-      <w:proofErr w:type="spellStart"/>
-      <w:r>
-        <w:rPr>
-          <w:rFonts w:ascii="Times New Roman" w:eastAsia="STSong" w:hAnsi="Times New Roman"/>
-          <w:color w:val="000000" w:themeColor="text1"/>
-          <w:sz w:val="24"/>
-          <w:szCs w:val="24"/>
-        </w:rPr>
-        <w:t>Takahshi</w:t>
-      </w:r>
-      <w:proofErr w:type="spellEnd"/>
-      <w:r>
-        <w:rPr>
-          <w:rFonts w:ascii="Times New Roman" w:eastAsia="STSong" w:hAnsi="Times New Roman"/>
-          <w:color w:val="000000" w:themeColor="text1"/>
-          <w:sz w:val="24"/>
-          <w:szCs w:val="24"/>
-        </w:rPr>
-        <w:t xml:space="preserve">, and </w:t>
+        <w:t xml:space="preserve">, M. Lebsock, J. L. Li, H. Takahshi, and </w:t>
       </w:r>
       <w:r>
         <w:rPr>
@@ -2221,29 +1930,7 @@
           <w:sz w:val="24"/>
           <w:szCs w:val="24"/>
         </w:rPr>
-        <w:t xml:space="preserve">Q. J. Royal </w:t>
-      </w:r>
-      <w:proofErr w:type="spellStart"/>
-      <w:r>
-        <w:rPr>
-          <w:rFonts w:ascii="Times New Roman" w:eastAsia="STSong" w:hAnsi="Times New Roman"/>
-          <w:i/>
-          <w:color w:val="000000" w:themeColor="text1"/>
-          <w:sz w:val="24"/>
-          <w:szCs w:val="24"/>
-        </w:rPr>
-        <w:t>Meteorol</w:t>
-      </w:r>
-      <w:proofErr w:type="spellEnd"/>
-      <w:r>
-        <w:rPr>
-          <w:rFonts w:ascii="Times New Roman" w:eastAsia="STSong" w:hAnsi="Times New Roman"/>
-          <w:i/>
-          <w:color w:val="000000" w:themeColor="text1"/>
-          <w:sz w:val="24"/>
-          <w:szCs w:val="24"/>
-        </w:rPr>
-        <w:t>. Soc</w:t>
+        <w:t>Q. J. Royal Meteorol. Soc</w:t>
       </w:r>
       <w:r>
         <w:rPr>
@@ -2263,7 +1950,7 @@
         </w:rPr>
         <w:t xml:space="preserve"> </w:t>
       </w:r>
-      <w:hyperlink r:id="rId12" w:history="1">
+      <w:hyperlink r:id="rId13" w:history="1">
         <w:r>
           <w:rPr>
             <w:rStyle w:val="Hyperlink"/>
@@ -2305,87 +1992,7 @@
           <w:sz w:val="24"/>
           <w:szCs w:val="24"/>
         </w:rPr>
-        <w:t xml:space="preserve">Maloney, E.D., A. </w:t>
-      </w:r>
-      <w:proofErr w:type="spellStart"/>
-      <w:r>
-        <w:rPr>
-          <w:rFonts w:ascii="Times New Roman" w:eastAsia="STSong" w:hAnsi="Times New Roman"/>
-          <w:color w:val="000000" w:themeColor="text1"/>
-          <w:sz w:val="24"/>
-          <w:szCs w:val="24"/>
-        </w:rPr>
-        <w:t>Gettelman</w:t>
-      </w:r>
-      <w:proofErr w:type="spellEnd"/>
-      <w:r>
-        <w:rPr>
-          <w:rFonts w:ascii="Times New Roman" w:eastAsia="STSong" w:hAnsi="Times New Roman"/>
-          <w:color w:val="000000" w:themeColor="text1"/>
-          <w:sz w:val="24"/>
-          <w:szCs w:val="24"/>
-        </w:rPr>
-        <w:t xml:space="preserve">, Y. Ming, J.D. </w:t>
-      </w:r>
-      <w:proofErr w:type="spellStart"/>
-      <w:r>
-        <w:rPr>
-          <w:rFonts w:ascii="Times New Roman" w:eastAsia="STSong" w:hAnsi="Times New Roman"/>
-          <w:color w:val="000000" w:themeColor="text1"/>
-          <w:sz w:val="24"/>
-          <w:szCs w:val="24"/>
-        </w:rPr>
-        <w:t>Neelin</w:t>
-      </w:r>
-      <w:proofErr w:type="spellEnd"/>
-      <w:r>
-        <w:rPr>
-          <w:rFonts w:ascii="Times New Roman" w:eastAsia="STSong" w:hAnsi="Times New Roman"/>
-          <w:color w:val="000000" w:themeColor="text1"/>
-          <w:sz w:val="24"/>
-          <w:szCs w:val="24"/>
-        </w:rPr>
-        <w:t xml:space="preserve">, D. Barrie, A. </w:t>
-      </w:r>
-      <w:proofErr w:type="spellStart"/>
-      <w:r>
-        <w:rPr>
-          <w:rFonts w:ascii="Times New Roman" w:eastAsia="STSong" w:hAnsi="Times New Roman"/>
-          <w:color w:val="000000" w:themeColor="text1"/>
-          <w:sz w:val="24"/>
-          <w:szCs w:val="24"/>
-        </w:rPr>
-        <w:t>Mariotti</w:t>
-      </w:r>
-      <w:proofErr w:type="spellEnd"/>
-      <w:r>
-        <w:rPr>
-          <w:rFonts w:ascii="Times New Roman" w:eastAsia="STSong" w:hAnsi="Times New Roman"/>
-          <w:color w:val="000000" w:themeColor="text1"/>
-          <w:sz w:val="24"/>
-          <w:szCs w:val="24"/>
-        </w:rPr>
-        <w:t xml:space="preserve">, C. Chen, D.R. Coleman, Y. </w:t>
-      </w:r>
-      <w:proofErr w:type="spellStart"/>
-      <w:r>
-        <w:rPr>
-          <w:rFonts w:ascii="Times New Roman" w:eastAsia="STSong" w:hAnsi="Times New Roman"/>
-          <w:color w:val="000000" w:themeColor="text1"/>
-          <w:sz w:val="24"/>
-          <w:szCs w:val="24"/>
-        </w:rPr>
-        <w:t>Kuo</w:t>
-      </w:r>
-      <w:proofErr w:type="spellEnd"/>
-      <w:r>
-        <w:rPr>
-          <w:rFonts w:ascii="Times New Roman" w:eastAsia="STSong" w:hAnsi="Times New Roman"/>
-          <w:color w:val="000000" w:themeColor="text1"/>
-          <w:sz w:val="24"/>
-          <w:szCs w:val="24"/>
-        </w:rPr>
-        <w:t xml:space="preserve">, B. Singh, H. Annamalai, A. Berg, J.F. Booth, S.J. Camargo, A. Dai, A. Gonzalez, J. Hafner, X. Jiang, </w:t>
+        <w:t xml:space="preserve">Maloney, E.D., A. Gettelman, Y. Ming, J.D. Neelin, D. Barrie, A. Mariotti, C. Chen, D.R. Coleman, Y. Kuo, B. Singh, H. Annamalai, A. Berg, J.F. Booth, S.J. Camargo, A. Dai, A. Gonzalez, J. Hafner, X. Jiang, </w:t>
       </w:r>
       <w:r>
         <w:rPr>
@@ -2404,27 +2011,7 @@
           <w:sz w:val="24"/>
           <w:szCs w:val="24"/>
         </w:rPr>
-        <w:t xml:space="preserve">, D. Kim, A. Kumar, Y. Moon, C.M. </w:t>
-      </w:r>
-      <w:proofErr w:type="spellStart"/>
-      <w:r>
-        <w:rPr>
-          <w:rFonts w:ascii="Times New Roman" w:eastAsia="STSong" w:hAnsi="Times New Roman"/>
-          <w:color w:val="000000" w:themeColor="text1"/>
-          <w:sz w:val="24"/>
-          <w:szCs w:val="24"/>
-        </w:rPr>
-        <w:t>Naud</w:t>
-      </w:r>
-      <w:proofErr w:type="spellEnd"/>
-      <w:r>
-        <w:rPr>
-          <w:rFonts w:ascii="Times New Roman" w:eastAsia="STSong" w:hAnsi="Times New Roman"/>
-          <w:color w:val="000000" w:themeColor="text1"/>
-          <w:sz w:val="24"/>
-          <w:szCs w:val="24"/>
-        </w:rPr>
-        <w:t>, A.H. Sobel, K. Suzuki, F. Wang, J. Wang, A.A. Wing, X. Xu, and M. Zhao, 2019: Process-Oriented Evaluation of Climate and Weather Forecasting Models. </w:t>
+        <w:t>, D. Kim, A. Kumar, Y. Moon, C.M. Naud, A.H. Sobel, K. Suzuki, F. Wang, J. Wang, A.A. Wing, X. Xu, and M. Zhao, 2019: Process-Oriented Evaluation of Climate and Weather Forecasting Models. </w:t>
       </w:r>
       <w:r>
         <w:rPr>
@@ -2463,7 +2050,7 @@
         </w:rPr>
         <w:t> </w:t>
       </w:r>
-      <w:hyperlink r:id="rId13" w:history="1">
+      <w:hyperlink r:id="rId14" w:history="1">
         <w:r>
           <w:rPr>
             <w:rStyle w:val="Hyperlink"/>
@@ -2565,7 +2152,6 @@
         </w:rPr>
         <w:t xml:space="preserve">The impact of process-based warm rain constraints on the aerosol indirect effect. </w:t>
       </w:r>
-      <w:proofErr w:type="spellStart"/>
       <w:r>
         <w:rPr>
           <w:rFonts w:ascii="Times New Roman" w:eastAsia="STSong" w:hAnsi="Times New Roman"/>
@@ -2576,7 +2162,6 @@
         </w:rPr>
         <w:t>Geophys</w:t>
       </w:r>
-      <w:proofErr w:type="spellEnd"/>
       <w:r>
         <w:rPr>
           <w:rFonts w:ascii="Times New Roman" w:eastAsia="STSong" w:hAnsi="Times New Roman"/>
@@ -2880,7 +2465,7 @@
         </w:rPr>
         <w:t xml:space="preserve">233-245, </w:t>
       </w:r>
-      <w:hyperlink r:id="rId14" w:history="1">
+      <w:hyperlink r:id="rId15" w:history="1">
         <w:r>
           <w:rPr>
             <w:rStyle w:val="Hyperlink"/>
@@ -2936,47 +2521,7 @@
           <w:sz w:val="24"/>
           <w:szCs w:val="24"/>
         </w:rPr>
-        <w:t xml:space="preserve">, K. Suzuki, H. Guo, D. </w:t>
-      </w:r>
-      <w:proofErr w:type="spellStart"/>
-      <w:r>
-        <w:rPr>
-          <w:rFonts w:ascii="Times New Roman" w:eastAsia="STSong" w:hAnsi="Times New Roman"/>
-          <w:color w:val="000000" w:themeColor="text1"/>
-          <w:sz w:val="24"/>
-          <w:szCs w:val="24"/>
-        </w:rPr>
-        <w:t>Goto</w:t>
-      </w:r>
-      <w:proofErr w:type="spellEnd"/>
-      <w:r>
-        <w:rPr>
-          <w:rFonts w:ascii="Times New Roman" w:eastAsia="STSong" w:hAnsi="Times New Roman"/>
-          <w:color w:val="000000" w:themeColor="text1"/>
-          <w:sz w:val="24"/>
-          <w:szCs w:val="24"/>
-        </w:rPr>
-        <w:t xml:space="preserve">, T. Ogura, T. Koshiro, and J. </w:t>
-      </w:r>
-      <w:proofErr w:type="spellStart"/>
-      <w:r>
-        <w:rPr>
-          <w:rFonts w:ascii="Times New Roman" w:eastAsia="STSong" w:hAnsi="Times New Roman"/>
-          <w:color w:val="000000" w:themeColor="text1"/>
-          <w:sz w:val="24"/>
-          <w:szCs w:val="24"/>
-        </w:rPr>
-        <w:t>Mülmenstädt</w:t>
-      </w:r>
-      <w:proofErr w:type="spellEnd"/>
-      <w:r>
-        <w:rPr>
-          <w:rFonts w:ascii="Times New Roman" w:eastAsia="STSong" w:hAnsi="Times New Roman"/>
-          <w:color w:val="000000" w:themeColor="text1"/>
-          <w:sz w:val="24"/>
-          <w:szCs w:val="24"/>
-        </w:rPr>
-        <w:t>, 2017</w:t>
+        <w:t>, K. Suzuki, H. Guo, D. Goto, T. Ogura, T. Koshiro, and J. Mülmenstädt, 2017</w:t>
       </w:r>
       <w:r>
         <w:rPr>
@@ -3004,29 +2549,7 @@
           <w:sz w:val="24"/>
           <w:szCs w:val="24"/>
         </w:rPr>
-        <w:t xml:space="preserve">J. </w:t>
-      </w:r>
-      <w:proofErr w:type="spellStart"/>
-      <w:r>
-        <w:rPr>
-          <w:rFonts w:ascii="Times New Roman" w:eastAsia="STSong" w:hAnsi="Times New Roman"/>
-          <w:i/>
-          <w:color w:val="000000" w:themeColor="text1"/>
-          <w:sz w:val="24"/>
-          <w:szCs w:val="24"/>
-        </w:rPr>
-        <w:t>Geophys</w:t>
-      </w:r>
-      <w:proofErr w:type="spellEnd"/>
-      <w:r>
-        <w:rPr>
-          <w:rFonts w:ascii="Times New Roman" w:eastAsia="STSong" w:hAnsi="Times New Roman"/>
-          <w:i/>
-          <w:color w:val="000000" w:themeColor="text1"/>
-          <w:sz w:val="24"/>
-          <w:szCs w:val="24"/>
-        </w:rPr>
-        <w:t>. Res</w:t>
+        <w:t>J. Geophys. Res</w:t>
       </w:r>
       <w:r>
         <w:rPr>
@@ -3055,7 +2578,7 @@
         </w:rPr>
         <w:t xml:space="preserve"> </w:t>
       </w:r>
-      <w:hyperlink r:id="rId15" w:history="1">
+      <w:hyperlink r:id="rId16" w:history="1">
         <w:r>
           <w:rPr>
             <w:rStyle w:val="Hyperlink"/>
@@ -3307,7 +2830,7 @@
         </w:rPr>
         <w:t xml:space="preserve"> </w:t>
       </w:r>
-      <w:hyperlink r:id="rId16" w:history="1">
+      <w:hyperlink r:id="rId17" w:history="1">
         <w:r>
           <w:rPr>
             <w:rStyle w:val="Hyperlink"/>
@@ -3450,7 +2973,7 @@
         </w:rPr>
         <w:t xml:space="preserve"> </w:t>
       </w:r>
-      <w:hyperlink r:id="rId17" w:history="1">
+      <w:hyperlink r:id="rId18" w:history="1">
         <w:r>
           <w:rPr>
             <w:rStyle w:val="Hyperlink"/>
@@ -3515,18 +3038,7 @@
           <w:sz w:val="24"/>
           <w:szCs w:val="24"/>
         </w:rPr>
-        <w:t xml:space="preserve">, </w:t>
-      </w:r>
-      <w:proofErr w:type="spellStart"/>
-      <w:proofErr w:type="gramStart"/>
-      <w:r>
-        <w:rPr>
-          <w:rFonts w:ascii="Times New Roman" w:eastAsia="STSong" w:hAnsi="Times New Roman"/>
-          <w:color w:val="000000" w:themeColor="text1"/>
-          <w:sz w:val="24"/>
-          <w:szCs w:val="24"/>
-        </w:rPr>
-        <w:t>K</w:t>
+        <w:t>, K</w:t>
       </w:r>
       <w:r>
         <w:rPr>
@@ -3544,18 +3056,7 @@
           <w:sz w:val="24"/>
           <w:szCs w:val="24"/>
         </w:rPr>
-        <w:t>Yang</w:t>
-      </w:r>
-      <w:proofErr w:type="spellEnd"/>
-      <w:proofErr w:type="gramEnd"/>
-      <w:r>
-        <w:rPr>
-          <w:rFonts w:ascii="Times New Roman" w:eastAsia="STSong" w:hAnsi="Times New Roman"/>
-          <w:color w:val="000000" w:themeColor="text1"/>
-          <w:sz w:val="24"/>
-          <w:szCs w:val="24"/>
-        </w:rPr>
-        <w:t>, J</w:t>
+        <w:t>Yang, J</w:t>
       </w:r>
       <w:r>
         <w:rPr>
@@ -3591,148 +3092,128 @@
           <w:sz w:val="24"/>
           <w:szCs w:val="24"/>
         </w:rPr>
+        <w:t xml:space="preserve"> Niu, C</w:t>
+      </w:r>
+      <w:r>
+        <w:rPr>
+          <w:rFonts w:ascii="Times New Roman" w:eastAsia="STSong" w:hAnsi="Times New Roman"/>
+          <w:color w:val="000000" w:themeColor="text1"/>
+          <w:sz w:val="24"/>
+          <w:szCs w:val="24"/>
+        </w:rPr>
+        <w:t xml:space="preserve">. </w:t>
+      </w:r>
+      <w:r>
+        <w:rPr>
+          <w:rFonts w:ascii="Times New Roman" w:eastAsia="STSong" w:hAnsi="Times New Roman"/>
+          <w:color w:val="000000" w:themeColor="text1"/>
+          <w:sz w:val="24"/>
+          <w:szCs w:val="24"/>
+        </w:rPr>
+        <w:t xml:space="preserve">Lin, </w:t>
+      </w:r>
+      <w:r>
+        <w:rPr>
+          <w:rFonts w:ascii="Times New Roman" w:eastAsia="STSong" w:hAnsi="Times New Roman"/>
+          <w:color w:val="000000" w:themeColor="text1"/>
+          <w:sz w:val="24"/>
+          <w:szCs w:val="24"/>
+        </w:rPr>
+        <w:t xml:space="preserve">and </w:t>
+      </w:r>
+      <w:r>
+        <w:rPr>
+          <w:rFonts w:ascii="Times New Roman" w:eastAsia="STSong" w:hAnsi="Times New Roman"/>
+          <w:b/>
+          <w:color w:val="000000" w:themeColor="text1"/>
+          <w:sz w:val="24"/>
+          <w:szCs w:val="24"/>
+        </w:rPr>
+        <w:t>X. Jing</w:t>
+      </w:r>
+      <w:r>
+        <w:rPr>
+          <w:rFonts w:ascii="Times New Roman" w:eastAsia="STSong" w:hAnsi="Times New Roman"/>
+          <w:color w:val="000000" w:themeColor="text1"/>
+          <w:sz w:val="24"/>
+          <w:szCs w:val="24"/>
+        </w:rPr>
+        <w:t>, 2017</w:t>
+      </w:r>
+      <w:r>
+        <w:rPr>
+          <w:rFonts w:ascii="Times New Roman" w:eastAsia="STSong" w:hAnsi="Times New Roman"/>
+          <w:color w:val="000000" w:themeColor="text1"/>
+          <w:sz w:val="24"/>
+          <w:szCs w:val="24"/>
+        </w:rPr>
+        <w:t>.</w:t>
+      </w:r>
+      <w:r>
+        <w:rPr>
+          <w:rFonts w:ascii="Times New Roman" w:eastAsia="STSong" w:hAnsi="Times New Roman"/>
+          <w:color w:val="000000" w:themeColor="text1"/>
+          <w:sz w:val="24"/>
+          <w:szCs w:val="24"/>
+        </w:rPr>
+        <w:t xml:space="preserve"> A revisit to decadal change of aerosol optical depth and its impact on global radiation over China, </w:t>
+      </w:r>
+      <w:r>
+        <w:rPr>
+          <w:rFonts w:ascii="Times New Roman" w:eastAsia="STSong" w:hAnsi="Times New Roman"/>
+          <w:i/>
+          <w:color w:val="000000" w:themeColor="text1"/>
+          <w:sz w:val="24"/>
+          <w:szCs w:val="24"/>
+        </w:rPr>
+        <w:t>Atmospheric Environment</w:t>
+      </w:r>
+      <w:r>
+        <w:rPr>
+          <w:rFonts w:ascii="Times New Roman" w:eastAsia="STSong" w:hAnsi="Times New Roman"/>
+          <w:color w:val="000000" w:themeColor="text1"/>
+          <w:sz w:val="24"/>
+          <w:szCs w:val="24"/>
+        </w:rPr>
+        <w:t>, 150, 106</w:t>
+      </w:r>
+      <w:r>
+        <w:rPr>
+          <w:rFonts w:ascii="Times New Roman" w:eastAsia="STSong" w:hAnsi="Times New Roman"/>
+          <w:color w:val="000000" w:themeColor="text1"/>
+          <w:sz w:val="24"/>
+          <w:szCs w:val="24"/>
+        </w:rPr>
+        <w:t>–</w:t>
+      </w:r>
+      <w:r>
+        <w:rPr>
+          <w:rFonts w:ascii="Times New Roman" w:eastAsia="STSong" w:hAnsi="Times New Roman"/>
+          <w:color w:val="000000" w:themeColor="text1"/>
+          <w:sz w:val="24"/>
+          <w:szCs w:val="24"/>
+        </w:rPr>
+        <w:t>115</w:t>
+      </w:r>
+      <w:r>
+        <w:rPr>
+          <w:rFonts w:ascii="Times New Roman" w:eastAsia="STSong" w:hAnsi="Times New Roman"/>
+          <w:color w:val="000000" w:themeColor="text1"/>
+          <w:sz w:val="24"/>
+          <w:szCs w:val="24"/>
+        </w:rPr>
+        <w:t>,</w:t>
+      </w:r>
+      <w:r>
+        <w:rPr>
+          <w:rFonts w:ascii="Times New Roman" w:eastAsia="STSong" w:hAnsi="Times New Roman"/>
+          <w:color w:val="000000" w:themeColor="text1"/>
+          <w:sz w:val="24"/>
+          <w:szCs w:val="24"/>
+        </w:rPr>
         <w:t xml:space="preserve"> </w:t>
       </w:r>
-      <w:proofErr w:type="spellStart"/>
-      <w:r>
-        <w:rPr>
-          <w:rFonts w:ascii="Times New Roman" w:eastAsia="STSong" w:hAnsi="Times New Roman"/>
-          <w:color w:val="000000" w:themeColor="text1"/>
-          <w:sz w:val="24"/>
-          <w:szCs w:val="24"/>
-        </w:rPr>
-        <w:t>Niu</w:t>
-      </w:r>
-      <w:proofErr w:type="spellEnd"/>
-      <w:r>
-        <w:rPr>
-          <w:rFonts w:ascii="Times New Roman" w:eastAsia="STSong" w:hAnsi="Times New Roman"/>
-          <w:color w:val="000000" w:themeColor="text1"/>
-          <w:sz w:val="24"/>
-          <w:szCs w:val="24"/>
-        </w:rPr>
-        <w:t>, C</w:t>
-      </w:r>
-      <w:r>
-        <w:rPr>
-          <w:rFonts w:ascii="Times New Roman" w:eastAsia="STSong" w:hAnsi="Times New Roman"/>
-          <w:color w:val="000000" w:themeColor="text1"/>
-          <w:sz w:val="24"/>
-          <w:szCs w:val="24"/>
-        </w:rPr>
-        <w:t xml:space="preserve">. </w:t>
-      </w:r>
-      <w:r>
-        <w:rPr>
-          <w:rFonts w:ascii="Times New Roman" w:eastAsia="STSong" w:hAnsi="Times New Roman"/>
-          <w:color w:val="000000" w:themeColor="text1"/>
-          <w:sz w:val="24"/>
-          <w:szCs w:val="24"/>
-        </w:rPr>
-        <w:t xml:space="preserve">Lin, </w:t>
-      </w:r>
-      <w:r>
-        <w:rPr>
-          <w:rFonts w:ascii="Times New Roman" w:eastAsia="STSong" w:hAnsi="Times New Roman"/>
-          <w:color w:val="000000" w:themeColor="text1"/>
-          <w:sz w:val="24"/>
-          <w:szCs w:val="24"/>
-        </w:rPr>
-        <w:t xml:space="preserve">and </w:t>
-      </w:r>
-      <w:r>
-        <w:rPr>
-          <w:rFonts w:ascii="Times New Roman" w:eastAsia="STSong" w:hAnsi="Times New Roman"/>
-          <w:b/>
-          <w:color w:val="000000" w:themeColor="text1"/>
-          <w:sz w:val="24"/>
-          <w:szCs w:val="24"/>
-        </w:rPr>
-        <w:t>X. Jing</w:t>
-      </w:r>
-      <w:r>
-        <w:rPr>
-          <w:rFonts w:ascii="Times New Roman" w:eastAsia="STSong" w:hAnsi="Times New Roman"/>
-          <w:color w:val="000000" w:themeColor="text1"/>
-          <w:sz w:val="24"/>
-          <w:szCs w:val="24"/>
-        </w:rPr>
-        <w:t>, 2017</w:t>
-      </w:r>
-      <w:r>
-        <w:rPr>
-          <w:rFonts w:ascii="Times New Roman" w:eastAsia="STSong" w:hAnsi="Times New Roman"/>
-          <w:color w:val="000000" w:themeColor="text1"/>
-          <w:sz w:val="24"/>
-          <w:szCs w:val="24"/>
-        </w:rPr>
-        <w:t>.</w:t>
-      </w:r>
-      <w:r>
-        <w:rPr>
-          <w:rFonts w:ascii="Times New Roman" w:eastAsia="STSong" w:hAnsi="Times New Roman"/>
-          <w:color w:val="000000" w:themeColor="text1"/>
-          <w:sz w:val="24"/>
-          <w:szCs w:val="24"/>
-        </w:rPr>
-        <w:t xml:space="preserve"> A revisit to decadal change of aerosol optical depth and its impact on global radiation over China, </w:t>
-      </w:r>
-      <w:r>
-        <w:rPr>
-          <w:rFonts w:ascii="Times New Roman" w:eastAsia="STSong" w:hAnsi="Times New Roman"/>
-          <w:i/>
-          <w:color w:val="000000" w:themeColor="text1"/>
-          <w:sz w:val="24"/>
-          <w:szCs w:val="24"/>
-        </w:rPr>
-        <w:t>Atmospheric Environment</w:t>
-      </w:r>
-      <w:r>
-        <w:rPr>
-          <w:rFonts w:ascii="Times New Roman" w:eastAsia="STSong" w:hAnsi="Times New Roman"/>
-          <w:color w:val="000000" w:themeColor="text1"/>
-          <w:sz w:val="24"/>
-          <w:szCs w:val="24"/>
-        </w:rPr>
-        <w:t>, 150, 106</w:t>
-      </w:r>
-      <w:r>
-        <w:rPr>
-          <w:rFonts w:ascii="Times New Roman" w:eastAsia="STSong" w:hAnsi="Times New Roman"/>
-          <w:color w:val="000000" w:themeColor="text1"/>
-          <w:sz w:val="24"/>
-          <w:szCs w:val="24"/>
-        </w:rPr>
-        <w:t>–</w:t>
-      </w:r>
-      <w:r>
-        <w:rPr>
-          <w:rFonts w:ascii="Times New Roman" w:eastAsia="STSong" w:hAnsi="Times New Roman"/>
-          <w:color w:val="000000" w:themeColor="text1"/>
-          <w:sz w:val="24"/>
-          <w:szCs w:val="24"/>
-        </w:rPr>
-        <w:t>115</w:t>
-      </w:r>
-      <w:r>
-        <w:rPr>
-          <w:rFonts w:ascii="Times New Roman" w:eastAsia="STSong" w:hAnsi="Times New Roman"/>
-          <w:color w:val="000000" w:themeColor="text1"/>
-          <w:sz w:val="24"/>
-          <w:szCs w:val="24"/>
-        </w:rPr>
-        <w:t>,</w:t>
-      </w:r>
-      <w:r>
-        <w:rPr>
-          <w:rFonts w:ascii="Times New Roman" w:eastAsia="STSong" w:hAnsi="Times New Roman"/>
-          <w:color w:val="000000" w:themeColor="text1"/>
-          <w:sz w:val="24"/>
-          <w:szCs w:val="24"/>
-        </w:rPr>
-        <w:t xml:space="preserve"> </w:t>
-      </w:r>
-      <w:hyperlink r:id="rId18" w:history="1">
+      <w:hyperlink r:id="rId19" w:history="1">
         <w:r>
           <w:rPr>
             <w:rStyle w:val="Hyperlink"/>
@@ -3894,47 +3375,7 @@
           <w:sz w:val="24"/>
           <w:szCs w:val="24"/>
         </w:rPr>
-        <w:t xml:space="preserve"> 2016. Cloud Overlapping parameter Obtained from </w:t>
-      </w:r>
-      <w:proofErr w:type="spellStart"/>
-      <w:r>
-        <w:rPr>
-          <w:rFonts w:ascii="Times New Roman" w:eastAsia="STSong" w:hAnsi="Times New Roman"/>
-          <w:color w:val="000000" w:themeColor="text1"/>
-          <w:sz w:val="24"/>
-          <w:szCs w:val="24"/>
-        </w:rPr>
-        <w:t>CloudSat</w:t>
-      </w:r>
-      <w:proofErr w:type="spellEnd"/>
-      <w:r>
-        <w:rPr>
-          <w:rFonts w:ascii="Times New Roman" w:eastAsia="STSong" w:hAnsi="Times New Roman"/>
-          <w:color w:val="000000" w:themeColor="text1"/>
-          <w:sz w:val="24"/>
-          <w:szCs w:val="24"/>
-        </w:rPr>
-        <w:t xml:space="preserve">/CALIPSO Dataset and Its Application in AGCM with </w:t>
-      </w:r>
-      <w:proofErr w:type="spellStart"/>
-      <w:r>
-        <w:rPr>
-          <w:rFonts w:ascii="Times New Roman" w:eastAsia="STSong" w:hAnsi="Times New Roman"/>
-          <w:color w:val="000000" w:themeColor="text1"/>
-          <w:sz w:val="24"/>
-          <w:szCs w:val="24"/>
-        </w:rPr>
-        <w:t>McICA</w:t>
-      </w:r>
-      <w:proofErr w:type="spellEnd"/>
-      <w:r>
-        <w:rPr>
-          <w:rFonts w:ascii="Times New Roman" w:eastAsia="STSong" w:hAnsi="Times New Roman"/>
-          <w:color w:val="000000" w:themeColor="text1"/>
-          <w:sz w:val="24"/>
-          <w:szCs w:val="24"/>
-        </w:rPr>
-        <w:t xml:space="preserve"> Scheme</w:t>
+        <w:t xml:space="preserve"> 2016. Cloud Overlapping parameter Obtained from CloudSat/CALIPSO Dataset and Its Application in AGCM with McICA Scheme</w:t>
       </w:r>
       <w:r>
         <w:rPr>
@@ -4022,7 +3463,7 @@
         </w:rPr>
         <w:t xml:space="preserve"> </w:t>
       </w:r>
-      <w:hyperlink r:id="rId19" w:history="1">
+      <w:hyperlink r:id="rId20" w:history="1">
         <w:r>
           <w:rPr>
             <w:rStyle w:val="Hyperlink"/>
@@ -4241,7 +3682,7 @@
         </w:rPr>
         <w:t xml:space="preserve"> </w:t>
       </w:r>
-      <w:hyperlink r:id="rId20" w:history="1">
+      <w:hyperlink r:id="rId21" w:history="1">
         <w:r>
           <w:rPr>
             <w:rStyle w:val="Hyperlink"/>
@@ -4326,20 +3767,19 @@
           <w:szCs w:val="24"/>
           <w:lang w:val="de-DE"/>
         </w:rPr>
-        <w:t xml:space="preserve">Zhang, </w:t>
-      </w:r>
-      <w:proofErr w:type="spellStart"/>
-      <w:r>
-        <w:rPr>
-          <w:rFonts w:ascii="Times New Roman" w:eastAsia="STSong" w:hAnsi="Times New Roman"/>
+        <w:t xml:space="preserve">Zhang, and </w:t>
+      </w:r>
+      <w:r>
+        <w:rPr>
+          <w:rFonts w:ascii="Times New Roman" w:eastAsia="STSong" w:hAnsi="Times New Roman"/>
+          <w:b/>
           <w:color w:val="000000" w:themeColor="text1"/>
           <w:sz w:val="24"/>
           <w:szCs w:val="24"/>
           <w:lang w:val="de-DE"/>
         </w:rPr>
-        <w:t>and</w:t>
-      </w:r>
-      <w:proofErr w:type="spellEnd"/>
+        <w:t>X.</w:t>
+      </w:r>
       <w:r>
         <w:rPr>
           <w:rFonts w:ascii="Times New Roman" w:eastAsia="STSong" w:hAnsi="Times New Roman"/>
@@ -4359,165 +3799,132 @@
           <w:szCs w:val="24"/>
           <w:lang w:val="de-DE"/>
         </w:rPr>
-        <w:t>X.</w:t>
-      </w:r>
-      <w:r>
-        <w:rPr>
-          <w:rFonts w:ascii="Times New Roman" w:eastAsia="STSong" w:hAnsi="Times New Roman"/>
+        <w:t>Jing</w:t>
+      </w:r>
+      <w:r>
+        <w:rPr>
+          <w:rFonts w:ascii="Times New Roman" w:eastAsia="STSong" w:hAnsi="Times New Roman"/>
+          <w:b/>
           <w:color w:val="000000" w:themeColor="text1"/>
           <w:sz w:val="24"/>
           <w:szCs w:val="24"/>
           <w:lang w:val="de-DE"/>
         </w:rPr>
+        <w:t xml:space="preserve">, </w:t>
+      </w:r>
+      <w:r>
+        <w:rPr>
+          <w:rFonts w:ascii="Times New Roman" w:eastAsia="STSong" w:hAnsi="Times New Roman"/>
+          <w:color w:val="000000" w:themeColor="text1"/>
+          <w:sz w:val="24"/>
+          <w:szCs w:val="24"/>
+          <w:lang w:val="de-DE"/>
+        </w:rPr>
+        <w:t>2015</w:t>
+      </w:r>
+      <w:r>
+        <w:rPr>
+          <w:rFonts w:ascii="Times New Roman" w:eastAsia="STSong" w:hAnsi="Times New Roman"/>
+          <w:color w:val="000000" w:themeColor="text1"/>
+          <w:sz w:val="24"/>
+          <w:szCs w:val="24"/>
+          <w:lang w:val="de-DE"/>
+        </w:rPr>
+        <w:t>.</w:t>
+      </w:r>
+      <w:r>
+        <w:rPr>
+          <w:rFonts w:ascii="Times New Roman" w:eastAsia="STSong" w:hAnsi="Times New Roman"/>
+          <w:color w:val="000000" w:themeColor="text1"/>
+          <w:sz w:val="24"/>
+          <w:szCs w:val="24"/>
+          <w:lang w:val="de-DE"/>
+        </w:rPr>
         <w:t xml:space="preserve"> </w:t>
       </w:r>
       <w:r>
         <w:rPr>
           <w:rFonts w:ascii="Times New Roman" w:eastAsia="STSong" w:hAnsi="Times New Roman"/>
-          <w:b/>
-          <w:color w:val="000000" w:themeColor="text1"/>
-          <w:sz w:val="24"/>
-          <w:szCs w:val="24"/>
-          <w:lang w:val="de-DE"/>
-        </w:rPr>
-        <w:t>Jing</w:t>
-      </w:r>
-      <w:r>
-        <w:rPr>
-          <w:rFonts w:ascii="Times New Roman" w:eastAsia="STSong" w:hAnsi="Times New Roman"/>
-          <w:b/>
-          <w:color w:val="000000" w:themeColor="text1"/>
-          <w:sz w:val="24"/>
-          <w:szCs w:val="24"/>
-          <w:lang w:val="de-DE"/>
-        </w:rPr>
-        <w:t xml:space="preserve">, </w:t>
-      </w:r>
-      <w:r>
-        <w:rPr>
-          <w:rFonts w:ascii="Times New Roman" w:eastAsia="STSong" w:hAnsi="Times New Roman"/>
-          <w:color w:val="000000" w:themeColor="text1"/>
-          <w:sz w:val="24"/>
-          <w:szCs w:val="24"/>
-          <w:lang w:val="de-DE"/>
-        </w:rPr>
-        <w:t>2015</w:t>
-      </w:r>
-      <w:r>
-        <w:rPr>
-          <w:rFonts w:ascii="Times New Roman" w:eastAsia="STSong" w:hAnsi="Times New Roman"/>
-          <w:color w:val="000000" w:themeColor="text1"/>
-          <w:sz w:val="24"/>
-          <w:szCs w:val="24"/>
-          <w:lang w:val="de-DE"/>
-        </w:rPr>
-        <w:t>.</w:t>
-      </w:r>
-      <w:r>
-        <w:rPr>
-          <w:rFonts w:ascii="Times New Roman" w:eastAsia="STSong" w:hAnsi="Times New Roman"/>
-          <w:color w:val="000000" w:themeColor="text1"/>
-          <w:sz w:val="24"/>
-          <w:szCs w:val="24"/>
-          <w:lang w:val="de-DE"/>
+          <w:color w:val="000000" w:themeColor="text1"/>
+          <w:sz w:val="24"/>
+          <w:szCs w:val="24"/>
+        </w:rPr>
+        <w:t>Impact of four</w:t>
+      </w:r>
+      <w:r>
+        <w:rPr>
+          <w:rFonts w:ascii="Cambria Math" w:eastAsia="STSong" w:hAnsi="Cambria Math" w:cs="Cambria Math"/>
+          <w:color w:val="000000" w:themeColor="text1"/>
+          <w:sz w:val="24"/>
+          <w:szCs w:val="24"/>
+        </w:rPr>
+        <w:t>‐</w:t>
+      </w:r>
+      <w:r>
+        <w:rPr>
+          <w:rFonts w:ascii="Times New Roman" w:eastAsia="STSong" w:hAnsi="Times New Roman"/>
+          <w:color w:val="000000" w:themeColor="text1"/>
+          <w:sz w:val="24"/>
+          <w:szCs w:val="24"/>
+        </w:rPr>
+        <w:t xml:space="preserve">stream radiative transfer algorithm on aerosol direct radiative effect and forcing. </w:t>
+      </w:r>
+      <w:r>
+        <w:rPr>
+          <w:rFonts w:ascii="Times New Roman" w:eastAsia="STSong" w:hAnsi="Times New Roman"/>
+          <w:i/>
+          <w:color w:val="000000" w:themeColor="text1"/>
+          <w:sz w:val="24"/>
+          <w:szCs w:val="24"/>
+        </w:rPr>
+        <w:t>Int. J. Climatol</w:t>
+      </w:r>
+      <w:r>
+        <w:rPr>
+          <w:rFonts w:ascii="Times New Roman" w:eastAsia="STSong" w:hAnsi="Times New Roman"/>
+          <w:color w:val="000000" w:themeColor="text1"/>
+          <w:sz w:val="24"/>
+          <w:szCs w:val="24"/>
+        </w:rPr>
+        <w:t>., 35: 4318</w:t>
+      </w:r>
+      <w:r>
+        <w:rPr>
+          <w:rFonts w:ascii="Times New Roman" w:eastAsia="STSong" w:hAnsi="Times New Roman"/>
+          <w:color w:val="000000" w:themeColor="text1"/>
+          <w:sz w:val="24"/>
+          <w:szCs w:val="24"/>
+        </w:rPr>
+        <w:t>–</w:t>
+      </w:r>
+      <w:r>
+        <w:rPr>
+          <w:rFonts w:ascii="Times New Roman" w:eastAsia="STSong" w:hAnsi="Times New Roman"/>
+          <w:color w:val="000000" w:themeColor="text1"/>
+          <w:sz w:val="24"/>
+          <w:szCs w:val="24"/>
+        </w:rPr>
+        <w:t>4328</w:t>
+      </w:r>
+      <w:r>
+        <w:rPr>
+          <w:rFonts w:ascii="Times New Roman" w:eastAsia="STSong" w:hAnsi="Times New Roman"/>
+          <w:color w:val="000000" w:themeColor="text1"/>
+          <w:sz w:val="24"/>
+          <w:szCs w:val="24"/>
+        </w:rPr>
+        <w:t>,</w:t>
+      </w:r>
+      <w:r>
+        <w:rPr>
+          <w:rFonts w:ascii="Times New Roman" w:eastAsia="STSong" w:hAnsi="Times New Roman"/>
+          <w:color w:val="000000" w:themeColor="text1"/>
+          <w:sz w:val="24"/>
+          <w:szCs w:val="24"/>
         </w:rPr>
         <w:t xml:space="preserve"> </w:t>
       </w:r>
-      <w:r>
-        <w:rPr>
-          <w:rFonts w:ascii="Times New Roman" w:eastAsia="STSong" w:hAnsi="Times New Roman"/>
-          <w:color w:val="000000" w:themeColor="text1"/>
-          <w:sz w:val="24"/>
-          <w:szCs w:val="24"/>
-        </w:rPr>
-        <w:t>Impact of four</w:t>
-      </w:r>
-      <w:r>
-        <w:rPr>
-          <w:rFonts w:ascii="Cambria Math" w:eastAsia="STSong" w:hAnsi="Cambria Math" w:cs="Cambria Math"/>
-          <w:color w:val="000000" w:themeColor="text1"/>
-          <w:sz w:val="24"/>
-          <w:szCs w:val="24"/>
-        </w:rPr>
-        <w:t>‐</w:t>
-      </w:r>
-      <w:r>
-        <w:rPr>
-          <w:rFonts w:ascii="Times New Roman" w:eastAsia="STSong" w:hAnsi="Times New Roman"/>
-          <w:color w:val="000000" w:themeColor="text1"/>
-          <w:sz w:val="24"/>
-          <w:szCs w:val="24"/>
-        </w:rPr>
-        <w:t xml:space="preserve">stream radiative transfer algorithm on aerosol direct radiative effect and forcing. </w:t>
-      </w:r>
-      <w:r>
-        <w:rPr>
-          <w:rFonts w:ascii="Times New Roman" w:eastAsia="STSong" w:hAnsi="Times New Roman"/>
-          <w:i/>
-          <w:color w:val="000000" w:themeColor="text1"/>
-          <w:sz w:val="24"/>
-          <w:szCs w:val="24"/>
-        </w:rPr>
-        <w:t xml:space="preserve">Int. J. </w:t>
-      </w:r>
-      <w:proofErr w:type="spellStart"/>
-      <w:r>
-        <w:rPr>
-          <w:rFonts w:ascii="Times New Roman" w:eastAsia="STSong" w:hAnsi="Times New Roman"/>
-          <w:i/>
-          <w:color w:val="000000" w:themeColor="text1"/>
-          <w:sz w:val="24"/>
-          <w:szCs w:val="24"/>
-        </w:rPr>
-        <w:t>Climatol</w:t>
-      </w:r>
-      <w:proofErr w:type="spellEnd"/>
-      <w:r>
-        <w:rPr>
-          <w:rFonts w:ascii="Times New Roman" w:eastAsia="STSong" w:hAnsi="Times New Roman"/>
-          <w:color w:val="000000" w:themeColor="text1"/>
-          <w:sz w:val="24"/>
-          <w:szCs w:val="24"/>
-        </w:rPr>
-        <w:t>., 35: 4318</w:t>
-      </w:r>
-      <w:r>
-        <w:rPr>
-          <w:rFonts w:ascii="Times New Roman" w:eastAsia="STSong" w:hAnsi="Times New Roman"/>
-          <w:color w:val="000000" w:themeColor="text1"/>
-          <w:sz w:val="24"/>
-          <w:szCs w:val="24"/>
-        </w:rPr>
-        <w:t>–</w:t>
-      </w:r>
-      <w:r>
-        <w:rPr>
-          <w:rFonts w:ascii="Times New Roman" w:eastAsia="STSong" w:hAnsi="Times New Roman"/>
-          <w:color w:val="000000" w:themeColor="text1"/>
-          <w:sz w:val="24"/>
-          <w:szCs w:val="24"/>
-        </w:rPr>
-        <w:t>4328</w:t>
-      </w:r>
-      <w:r>
-        <w:rPr>
-          <w:rFonts w:ascii="Times New Roman" w:eastAsia="STSong" w:hAnsi="Times New Roman"/>
-          <w:color w:val="000000" w:themeColor="text1"/>
-          <w:sz w:val="24"/>
-          <w:szCs w:val="24"/>
-        </w:rPr>
-        <w:t>,</w:t>
-      </w:r>
-      <w:r>
-        <w:rPr>
-          <w:rFonts w:ascii="Times New Roman" w:eastAsia="STSong" w:hAnsi="Times New Roman"/>
-          <w:color w:val="000000" w:themeColor="text1"/>
-          <w:sz w:val="24"/>
-          <w:szCs w:val="24"/>
-        </w:rPr>
-        <w:t xml:space="preserve"> </w:t>
-      </w:r>
-      <w:hyperlink r:id="rId21" w:history="1">
+      <w:hyperlink r:id="rId22" w:history="1">
         <w:r>
           <w:rPr>
             <w:rStyle w:val="Hyperlink"/>
@@ -4629,27 +4036,7 @@
           <w:sz w:val="24"/>
           <w:szCs w:val="24"/>
         </w:rPr>
-        <w:t xml:space="preserve"> 2014. Application and evaluation of a new radiation code under </w:t>
-      </w:r>
-      <w:proofErr w:type="spellStart"/>
-      <w:r>
-        <w:rPr>
-          <w:rFonts w:ascii="Times New Roman" w:eastAsia="STSong" w:hAnsi="Times New Roman"/>
-          <w:color w:val="000000" w:themeColor="text1"/>
-          <w:sz w:val="24"/>
-          <w:szCs w:val="24"/>
-        </w:rPr>
-        <w:t>McICA</w:t>
-      </w:r>
-      <w:proofErr w:type="spellEnd"/>
-      <w:r>
-        <w:rPr>
-          <w:rFonts w:ascii="Times New Roman" w:eastAsia="STSong" w:hAnsi="Times New Roman"/>
-          <w:color w:val="000000" w:themeColor="text1"/>
-          <w:sz w:val="24"/>
-          <w:szCs w:val="24"/>
-        </w:rPr>
-        <w:t xml:space="preserve"> scheme in BCC_AGCM2.0.1</w:t>
+        <w:t xml:space="preserve"> 2014. Application and evaluation of a new radiation code under McICA scheme in BCC_AGCM2.0.1</w:t>
       </w:r>
       <w:r>
         <w:rPr>
@@ -4659,29 +4046,7 @@
           <w:sz w:val="24"/>
           <w:szCs w:val="24"/>
         </w:rPr>
-        <w:t xml:space="preserve">. </w:t>
-      </w:r>
-      <w:proofErr w:type="spellStart"/>
-      <w:r>
-        <w:rPr>
-          <w:rFonts w:ascii="Times New Roman" w:eastAsia="STSong" w:hAnsi="Times New Roman"/>
-          <w:i/>
-          <w:color w:val="000000" w:themeColor="text1"/>
-          <w:sz w:val="24"/>
-          <w:szCs w:val="24"/>
-        </w:rPr>
-        <w:t>Geosci</w:t>
-      </w:r>
-      <w:proofErr w:type="spellEnd"/>
-      <w:r>
-        <w:rPr>
-          <w:rFonts w:ascii="Times New Roman" w:eastAsia="STSong" w:hAnsi="Times New Roman"/>
-          <w:i/>
-          <w:color w:val="000000" w:themeColor="text1"/>
-          <w:sz w:val="24"/>
-          <w:szCs w:val="24"/>
-        </w:rPr>
-        <w:t>. Model Dev</w:t>
+        <w:t>. Geosci. Model Dev</w:t>
       </w:r>
       <w:r>
         <w:rPr>
@@ -4728,7 +4093,7 @@
         </w:rPr>
         <w:t xml:space="preserve"> </w:t>
       </w:r>
-      <w:hyperlink r:id="rId22" w:history="1">
+      <w:hyperlink r:id="rId23" w:history="1">
         <w:r>
           <w:rPr>
             <w:rStyle w:val="Hyperlink"/>
@@ -4842,27 +4207,7 @@
           <w:sz w:val="24"/>
           <w:szCs w:val="24"/>
         </w:rPr>
-        <w:t xml:space="preserve"> 2013. Application and evaluation of </w:t>
-      </w:r>
-      <w:proofErr w:type="spellStart"/>
-      <w:r>
-        <w:rPr>
-          <w:rFonts w:ascii="Times New Roman" w:eastAsia="STSong" w:hAnsi="Times New Roman"/>
-          <w:color w:val="000000" w:themeColor="text1"/>
-          <w:sz w:val="24"/>
-          <w:szCs w:val="24"/>
-        </w:rPr>
-        <w:t>McICA</w:t>
-      </w:r>
-      <w:proofErr w:type="spellEnd"/>
-      <w:r>
-        <w:rPr>
-          <w:rFonts w:ascii="Times New Roman" w:eastAsia="STSong" w:hAnsi="Times New Roman"/>
-          <w:color w:val="000000" w:themeColor="text1"/>
-          <w:sz w:val="24"/>
-          <w:szCs w:val="24"/>
-        </w:rPr>
-        <w:t xml:space="preserve"> scheme in BCC_AGCM2.0.1. </w:t>
+        <w:t xml:space="preserve"> 2013. Application and evaluation of McICA scheme in BCC_AGCM2.0.1. </w:t>
       </w:r>
       <w:r>
         <w:rPr>
@@ -4901,7 +4246,7 @@
         </w:rPr>
         <w:t xml:space="preserve">, </w:t>
       </w:r>
-      <w:hyperlink r:id="rId23" w:history="1">
+      <w:hyperlink r:id="rId24" w:history="1">
         <w:r>
           <w:rPr>
             <w:rStyle w:val="Hyperlink"/>
@@ -4961,22 +4306,18 @@
           <w:szCs w:val="24"/>
           <w:lang w:val="de-DE"/>
         </w:rPr>
-        <w:t xml:space="preserve">X. </w:t>
-      </w:r>
-      <w:proofErr w:type="spellStart"/>
-      <w:r>
-        <w:rPr>
-          <w:rFonts w:ascii="Times New Roman" w:eastAsia="STSong" w:hAnsi="Times New Roman"/>
-          <w:b/>
-          <w:bCs/>
+        <w:t>X. Jing</w:t>
+      </w:r>
+      <w:r>
+        <w:rPr>
+          <w:rFonts w:ascii="Times New Roman" w:eastAsia="STSong" w:hAnsi="Times New Roman"/>
           <w:color w:val="000000" w:themeColor="text1"/>
           <w:sz w:val="24"/>
           <w:szCs w:val="24"/>
           <w:lang w:val="de-DE"/>
         </w:rPr>
-        <w:t>Jing</w:t>
-      </w:r>
-      <w:proofErr w:type="spellEnd"/>
+        <w:t>, and P. Lu</w:t>
+      </w:r>
       <w:r>
         <w:rPr>
           <w:rFonts w:ascii="Times New Roman" w:eastAsia="STSong" w:hAnsi="Times New Roman"/>
@@ -4987,7 +4328,6 @@
         </w:rPr>
         <w:t xml:space="preserve">, </w:t>
       </w:r>
-      <w:proofErr w:type="spellStart"/>
       <w:r>
         <w:rPr>
           <w:rFonts w:ascii="Times New Roman" w:eastAsia="STSong" w:hAnsi="Times New Roman"/>
@@ -4996,9 +4336,8 @@
           <w:szCs w:val="24"/>
           <w:lang w:val="de-DE"/>
         </w:rPr>
-        <w:t>and</w:t>
-      </w:r>
-      <w:proofErr w:type="spellEnd"/>
+        <w:t>2013</w:t>
+      </w:r>
       <w:r>
         <w:rPr>
           <w:rFonts w:ascii="Times New Roman" w:eastAsia="STSong" w:hAnsi="Times New Roman"/>
@@ -5007,9 +4346,8 @@
           <w:szCs w:val="24"/>
           <w:lang w:val="de-DE"/>
         </w:rPr>
-        <w:t xml:space="preserve"> P. </w:t>
-      </w:r>
-      <w:proofErr w:type="spellStart"/>
+        <w:t>.</w:t>
+      </w:r>
       <w:r>
         <w:rPr>
           <w:rFonts w:ascii="Times New Roman" w:eastAsia="STSong" w:hAnsi="Times New Roman"/>
@@ -5018,47 +4356,6 @@
           <w:szCs w:val="24"/>
           <w:lang w:val="de-DE"/>
         </w:rPr>
-        <w:t>Lu</w:t>
-      </w:r>
-      <w:proofErr w:type="spellEnd"/>
-      <w:r>
-        <w:rPr>
-          <w:rFonts w:ascii="Times New Roman" w:eastAsia="STSong" w:hAnsi="Times New Roman"/>
-          <w:color w:val="000000" w:themeColor="text1"/>
-          <w:sz w:val="24"/>
-          <w:szCs w:val="24"/>
-          <w:lang w:val="de-DE"/>
-        </w:rPr>
-        <w:t xml:space="preserve">, </w:t>
-      </w:r>
-      <w:r>
-        <w:rPr>
-          <w:rFonts w:ascii="Times New Roman" w:eastAsia="STSong" w:hAnsi="Times New Roman"/>
-          <w:color w:val="000000" w:themeColor="text1"/>
-          <w:sz w:val="24"/>
-          <w:szCs w:val="24"/>
-          <w:lang w:val="de-DE"/>
-        </w:rPr>
-        <w:t>2013</w:t>
-      </w:r>
-      <w:r>
-        <w:rPr>
-          <w:rFonts w:ascii="Times New Roman" w:eastAsia="STSong" w:hAnsi="Times New Roman"/>
-          <w:color w:val="000000" w:themeColor="text1"/>
-          <w:sz w:val="24"/>
-          <w:szCs w:val="24"/>
-          <w:lang w:val="de-DE"/>
-        </w:rPr>
-        <w:t>.</w:t>
-      </w:r>
-      <w:r>
-        <w:rPr>
-          <w:rFonts w:ascii="Times New Roman" w:eastAsia="STSong" w:hAnsi="Times New Roman"/>
-          <w:color w:val="000000" w:themeColor="text1"/>
-          <w:sz w:val="24"/>
-          <w:szCs w:val="24"/>
-          <w:lang w:val="de-DE"/>
-        </w:rPr>
         <w:t xml:space="preserve"> </w:t>
       </w:r>
       <w:r>
@@ -5078,9 +4375,17 @@
           <w:sz w:val="24"/>
           <w:szCs w:val="24"/>
         </w:rPr>
-        <w:t xml:space="preserve">J. </w:t>
-      </w:r>
-      <w:proofErr w:type="spellStart"/>
+        <w:t>J. Geophys. Res.</w:t>
+      </w:r>
+      <w:r>
+        <w:rPr>
+          <w:rFonts w:ascii="Times New Roman" w:eastAsia="STSong" w:hAnsi="Times New Roman"/>
+          <w:color w:val="000000" w:themeColor="text1"/>
+          <w:sz w:val="24"/>
+          <w:szCs w:val="24"/>
+        </w:rPr>
+        <w:t xml:space="preserve"> </w:t>
+      </w:r>
       <w:r>
         <w:rPr>
           <w:rFonts w:ascii="Times New Roman" w:eastAsia="STSong" w:hAnsi="Times New Roman"/>
@@ -5089,36 +4394,6 @@
           <w:sz w:val="24"/>
           <w:szCs w:val="24"/>
         </w:rPr>
-        <w:t>Geophys</w:t>
-      </w:r>
-      <w:proofErr w:type="spellEnd"/>
-      <w:r>
-        <w:rPr>
-          <w:rFonts w:ascii="Times New Roman" w:eastAsia="STSong" w:hAnsi="Times New Roman"/>
-          <w:i/>
-          <w:color w:val="000000" w:themeColor="text1"/>
-          <w:sz w:val="24"/>
-          <w:szCs w:val="24"/>
-        </w:rPr>
-        <w:t>. Res.</w:t>
-      </w:r>
-      <w:r>
-        <w:rPr>
-          <w:rFonts w:ascii="Times New Roman" w:eastAsia="STSong" w:hAnsi="Times New Roman"/>
-          <w:color w:val="000000" w:themeColor="text1"/>
-          <w:sz w:val="24"/>
-          <w:szCs w:val="24"/>
-        </w:rPr>
-        <w:t xml:space="preserve"> </w:t>
-      </w:r>
-      <w:r>
-        <w:rPr>
-          <w:rFonts w:ascii="Times New Roman" w:eastAsia="STSong" w:hAnsi="Times New Roman"/>
-          <w:i/>
-          <w:color w:val="000000" w:themeColor="text1"/>
-          <w:sz w:val="24"/>
-          <w:szCs w:val="24"/>
-        </w:rPr>
         <w:t>Atmos</w:t>
       </w:r>
       <w:r>
@@ -5130,7 +4405,7 @@
         </w:rPr>
         <w:t xml:space="preserve">., 118, 3662–3675, </w:t>
       </w:r>
-      <w:hyperlink r:id="rId24" w:history="1">
+      <w:hyperlink r:id="rId25" w:history="1">
         <w:r>
           <w:rPr>
             <w:rStyle w:val="Hyperlink"/>
@@ -5338,7 +4613,7 @@
         </w:rPr>
         <w:t xml:space="preserve">, </w:t>
       </w:r>
-      <w:hyperlink r:id="rId25" w:history="1">
+      <w:hyperlink r:id="rId26" w:history="1">
         <w:r>
           <w:rPr>
             <w:rStyle w:val="Hyperlink"/>
@@ -5512,7 +4787,7 @@
         </w:rPr>
         <w:t xml:space="preserve"> </w:t>
       </w:r>
-      <w:hyperlink r:id="rId26" w:history="1">
+      <w:hyperlink r:id="rId27" w:history="1">
         <w:r>
           <w:rPr>
             <w:rStyle w:val="Hyperlink"/>
@@ -5639,31 +4914,7 @@
           <w:sz w:val="24"/>
           <w:szCs w:val="24"/>
         </w:rPr>
-        <w:t xml:space="preserve">Acta </w:t>
-      </w:r>
-      <w:proofErr w:type="spellStart"/>
-      <w:r>
-        <w:rPr>
-          <w:rFonts w:ascii="Times New Roman" w:eastAsia="STSong" w:hAnsi="Times New Roman"/>
-          <w:i/>
-          <w:iCs/>
-          <w:color w:val="000000" w:themeColor="text1"/>
-          <w:sz w:val="24"/>
-          <w:szCs w:val="24"/>
-        </w:rPr>
-        <w:t>Meteorol</w:t>
-      </w:r>
-      <w:proofErr w:type="spellEnd"/>
-      <w:r>
-        <w:rPr>
-          <w:rFonts w:ascii="Times New Roman" w:eastAsia="STSong" w:hAnsi="Times New Roman"/>
-          <w:i/>
-          <w:iCs/>
-          <w:color w:val="000000" w:themeColor="text1"/>
-          <w:sz w:val="24"/>
-          <w:szCs w:val="24"/>
-        </w:rPr>
-        <w:t>. Sin</w:t>
+        <w:t>Acta Meteorol. Sin</w:t>
       </w:r>
       <w:r>
         <w:rPr>
@@ -5710,7 +4961,7 @@
         </w:rPr>
         <w:t> </w:t>
       </w:r>
-      <w:hyperlink r:id="rId27" w:history="1">
+      <w:hyperlink r:id="rId28" w:history="1">
         <w:r>
           <w:rPr>
             <w:rStyle w:val="Hyperlink"/>
@@ -5798,45 +5049,29 @@
           <w:color w:val="000000" w:themeColor="text1"/>
           <w:lang w:val="de-DE"/>
         </w:rPr>
-        <w:t xml:space="preserve">Zhang H., P. </w:t>
-      </w:r>
-      <w:proofErr w:type="spellStart"/>
-      <w:r>
-        <w:rPr>
+        <w:t xml:space="preserve">Zhang H., P. Lu, </w:t>
+      </w:r>
+      <w:r>
+        <w:rPr>
+          <w:b/>
+          <w:bCs/>
           <w:color w:val="000000" w:themeColor="text1"/>
           <w:lang w:val="de-DE"/>
         </w:rPr>
-        <w:t>Lu</w:t>
-      </w:r>
-      <w:proofErr w:type="spellEnd"/>
+        <w:t>X. Jing</w:t>
+      </w:r>
       <w:r>
         <w:rPr>
           <w:color w:val="000000" w:themeColor="text1"/>
           <w:lang w:val="de-DE"/>
         </w:rPr>
-        <w:t xml:space="preserve">, </w:t>
-      </w:r>
-      <w:r>
-        <w:rPr>
-          <w:b/>
-          <w:bCs/>
+        <w:t>,</w:t>
+      </w:r>
+      <w:r>
+        <w:rPr>
           <w:color w:val="000000" w:themeColor="text1"/>
           <w:lang w:val="de-DE"/>
         </w:rPr>
-        <w:t>X. Jing</w:t>
-      </w:r>
-      <w:r>
-        <w:rPr>
-          <w:color w:val="000000" w:themeColor="text1"/>
-          <w:lang w:val="de-DE"/>
-        </w:rPr>
-        <w:t>,</w:t>
-      </w:r>
-      <w:r>
-        <w:rPr>
-          <w:color w:val="000000" w:themeColor="text1"/>
-          <w:lang w:val="de-DE"/>
-        </w:rPr>
         <w:t xml:space="preserve"> 2015. </w:t>
       </w:r>
       <w:r>
@@ -5857,7 +5092,7 @@
         </w:rPr>
         <w:t xml:space="preserve">144, </w:t>
       </w:r>
-      <w:hyperlink r:id="rId28" w:history="1">
+      <w:hyperlink r:id="rId29" w:history="1">
         <w:r>
           <w:rPr>
             <w:rStyle w:val="Hyperlink"/>
@@ -5920,21 +5155,7 @@
         <w:rPr>
           <w:color w:val="000000" w:themeColor="text1"/>
         </w:rPr>
-        <w:t xml:space="preserve"> 2012. Application and Evaluation of </w:t>
-      </w:r>
-      <w:proofErr w:type="spellStart"/>
-      <w:r>
-        <w:rPr>
-          <w:color w:val="000000" w:themeColor="text1"/>
-        </w:rPr>
-        <w:t>McICA</w:t>
-      </w:r>
-      <w:proofErr w:type="spellEnd"/>
-      <w:r>
-        <w:rPr>
-          <w:color w:val="000000" w:themeColor="text1"/>
-        </w:rPr>
-        <w:t xml:space="preserve"> Cloud-Radiation Framework in the AGCM of the National Climate Center. Chinese Journal of Atmospheric Sciences (in Chinese), 36(5): 945</w:t>
+        <w:t xml:space="preserve"> 2012. Application and Evaluation of McICA Cloud-Radiation Framework in the AGCM of the National Climate Center. Chinese Journal of Atmospheric Sciences (in Chinese), 36(5): 945</w:t>
       </w:r>
       <w:r>
         <w:rPr>
@@ -5960,7 +5181,7 @@
         </w:rPr>
         <w:t xml:space="preserve"> </w:t>
       </w:r>
-      <w:hyperlink r:id="rId29" w:history="1">
+      <w:hyperlink r:id="rId30" w:history="1">
         <w:r>
           <w:rPr>
             <w:rStyle w:val="Hyperlink"/>
@@ -6051,7 +5272,7 @@
         </w:rPr>
         <w:t xml:space="preserve"> </w:t>
       </w:r>
-      <w:hyperlink r:id="rId30" w:history="1">
+      <w:hyperlink r:id="rId31" w:history="1">
         <w:r>
           <w:rPr>
             <w:rStyle w:val="Hyperlink"/>
@@ -6140,61 +5361,33 @@
         <w:rPr>
           <w:color w:val="000000" w:themeColor="text1"/>
         </w:rPr>
-        <w:t xml:space="preserve">A Study of the Effect of Sub-grid Cloud Structure on Global Radiation in Climate Models. Acta </w:t>
-      </w:r>
-      <w:proofErr w:type="spellStart"/>
-      <w:r>
-        <w:rPr>
-          <w:color w:val="000000" w:themeColor="text1"/>
-        </w:rPr>
-        <w:t>Meteorologica</w:t>
-      </w:r>
-      <w:proofErr w:type="spellEnd"/>
+        <w:t>A Study of the Effect of Sub-grid Cloud Structure on Global Radiation in Climate Models. Acta Meteorologica Sinica (in Chinese), 67(6): 1058</w:t>
+      </w:r>
+      <w:r>
+        <w:rPr>
+          <w:color w:val="000000" w:themeColor="text1"/>
+        </w:rPr>
+        <w:t>–</w:t>
+      </w:r>
+      <w:r>
+        <w:rPr>
+          <w:color w:val="000000" w:themeColor="text1"/>
+        </w:rPr>
+        <w:t>1068</w:t>
+      </w:r>
+      <w:r>
+        <w:rPr>
+          <w:color w:val="000000" w:themeColor="text1"/>
+        </w:rPr>
+        <w:t>,</w:t>
+      </w:r>
       <w:r>
         <w:rPr>
           <w:color w:val="000000" w:themeColor="text1"/>
         </w:rPr>
         <w:t xml:space="preserve"> </w:t>
       </w:r>
-      <w:proofErr w:type="spellStart"/>
-      <w:r>
-        <w:rPr>
-          <w:color w:val="000000" w:themeColor="text1"/>
-        </w:rPr>
-        <w:t>Sinica</w:t>
-      </w:r>
-      <w:proofErr w:type="spellEnd"/>
-      <w:r>
-        <w:rPr>
-          <w:color w:val="000000" w:themeColor="text1"/>
-        </w:rPr>
-        <w:t xml:space="preserve"> (in Chinese), 67(6): 1058</w:t>
-      </w:r>
-      <w:r>
-        <w:rPr>
-          <w:color w:val="000000" w:themeColor="text1"/>
-        </w:rPr>
-        <w:t>–</w:t>
-      </w:r>
-      <w:r>
-        <w:rPr>
-          <w:color w:val="000000" w:themeColor="text1"/>
-        </w:rPr>
-        <w:t>1068</w:t>
-      </w:r>
-      <w:r>
-        <w:rPr>
-          <w:color w:val="000000" w:themeColor="text1"/>
-        </w:rPr>
-        <w:t>,</w:t>
-      </w:r>
-      <w:r>
-        <w:rPr>
-          <w:color w:val="000000" w:themeColor="text1"/>
-        </w:rPr>
-        <w:t xml:space="preserve"> </w:t>
-      </w:r>
-      <w:hyperlink r:id="rId31" w:history="1">
+      <w:hyperlink r:id="rId32" w:history="1">
         <w:r>
           <w:rPr>
             <w:rStyle w:val="Hyperlink"/>
@@ -6710,27 +5903,7 @@
           <w:sz w:val="24"/>
           <w:szCs w:val="24"/>
         </w:rPr>
-        <w:t xml:space="preserve"> </w:t>
-      </w:r>
-      <w:proofErr w:type="spellStart"/>
-      <w:r>
-        <w:rPr>
-          <w:rFonts w:ascii="Times New Roman" w:hAnsi="Times New Roman"/>
-          <w:color w:val="000000" w:themeColor="text1"/>
-          <w:sz w:val="24"/>
-          <w:szCs w:val="24"/>
-        </w:rPr>
-        <w:t>Makuhari</w:t>
-      </w:r>
-      <w:proofErr w:type="spellEnd"/>
-      <w:r>
-        <w:rPr>
-          <w:rFonts w:ascii="Times New Roman" w:hAnsi="Times New Roman"/>
-          <w:color w:val="000000" w:themeColor="text1"/>
-          <w:sz w:val="24"/>
-          <w:szCs w:val="24"/>
-        </w:rPr>
-        <w:t xml:space="preserve"> Messe, Japan. Title: </w:t>
+        <w:t xml:space="preserve"> Makuhari Messe, Japan. Title: </w:t>
       </w:r>
       <w:r>
         <w:rPr>
@@ -6896,27 +6069,7 @@
           <w:sz w:val="24"/>
           <w:szCs w:val="24"/>
         </w:rPr>
-        <w:t xml:space="preserve"> </w:t>
-      </w:r>
-      <w:proofErr w:type="spellStart"/>
-      <w:r>
-        <w:rPr>
-          <w:rFonts w:ascii="Times New Roman" w:hAnsi="Times New Roman"/>
-          <w:color w:val="000000" w:themeColor="text1"/>
-          <w:sz w:val="24"/>
-          <w:szCs w:val="24"/>
-        </w:rPr>
-        <w:t>Makuhari</w:t>
-      </w:r>
-      <w:proofErr w:type="spellEnd"/>
-      <w:r>
-        <w:rPr>
-          <w:rFonts w:ascii="Times New Roman" w:hAnsi="Times New Roman"/>
-          <w:color w:val="000000" w:themeColor="text1"/>
-          <w:sz w:val="24"/>
-          <w:szCs w:val="24"/>
-        </w:rPr>
-        <w:t xml:space="preserve"> Messe, Japan. Title: The too-fast, too-frequent precipitation simulated in GCMs. </w:t>
+        <w:t xml:space="preserve"> Makuhari Messe, Japan. Title: The too-fast, too-frequent precipitation simulated in GCMs. </w:t>
       </w:r>
       <w:r>
         <w:rPr>
@@ -7044,27 +6197,7 @@
           <w:sz w:val="24"/>
           <w:szCs w:val="24"/>
         </w:rPr>
-        <w:t xml:space="preserve"> Prague, Czech Republic. Title: Application and evaluation of a new radiation code under </w:t>
-      </w:r>
-      <w:proofErr w:type="spellStart"/>
-      <w:r>
-        <w:rPr>
-          <w:rFonts w:ascii="Times New Roman" w:hAnsi="Times New Roman"/>
-          <w:color w:val="000000" w:themeColor="text1"/>
-          <w:sz w:val="24"/>
-          <w:szCs w:val="24"/>
-        </w:rPr>
-        <w:t>McICA</w:t>
-      </w:r>
-      <w:proofErr w:type="spellEnd"/>
-      <w:r>
-        <w:rPr>
-          <w:rFonts w:ascii="Times New Roman" w:hAnsi="Times New Roman"/>
-          <w:color w:val="000000" w:themeColor="text1"/>
-          <w:sz w:val="24"/>
-          <w:szCs w:val="24"/>
-        </w:rPr>
-        <w:t xml:space="preserve"> scheme in BCC_AGCM2.0. Poster.</w:t>
+        <w:t xml:space="preserve"> Prague, Czech Republic. Title: Application and evaluation of a new radiation code under McICA scheme in BCC_AGCM2.0. Poster.</w:t>
       </w:r>
       <w:bookmarkStart w:id="20" w:name="OLE_LINK65"/>
       <w:bookmarkStart w:id="21" w:name="OLE_LINK66"/>
@@ -7366,7 +6499,7 @@
         </w:rPr>
         <w:t>) special issue ‘</w:t>
       </w:r>
-      <w:hyperlink r:id="rId32" w:history="1">
+      <w:hyperlink r:id="rId33" w:history="1">
         <w:r>
           <w:rPr>
             <w:rStyle w:val="Hyperlink"/>
@@ -7517,8 +6650,8 @@
       </w:pPr>
     </w:p>
     <w:sectPr>
-      <w:footerReference w:type="even" r:id="rId33"/>
-      <w:footerReference w:type="default" r:id="rId34"/>
+      <w:footerReference w:type="even" r:id="rId34"/>
+      <w:footerReference w:type="default" r:id="rId35"/>
       <w:pgSz w:w="11906" w:h="16838"/>
       <w:pgMar w:top="1440" w:right="1800" w:bottom="1440" w:left="1800" w:header="851" w:footer="992" w:gutter="0"/>
       <w:cols w:space="425"/>

</xml_diff>